<commit_message>
feat: complete student absence system with Telegram automation, mobile portal, APK, and Firebase setup
</commit_message>
<xml_diff>
--- a/prompt.docx
+++ b/prompt.docx
@@ -27,7 +27,15 @@
         <w:t>), កាលបរិច្ឆេទ</w:t>
       </w:r>
       <w:r>
-        <w:t xml:space="preserve"> (dd/mm/yyyy)</w:t>
+        <w:t xml:space="preserve"> (dd/mm/</w:t>
+      </w:r>
+      <w:proofErr w:type="spellStart"/>
+      <w:r>
+        <w:t>yyyy</w:t>
+      </w:r>
+      <w:proofErr w:type="spellEnd"/>
+      <w:r>
+        <w:t>)</w:t>
       </w:r>
       <w:r>
         <w:rPr>
@@ -339,50 +347,2902 @@
     <w:p>
       <w:pPr>
         <w:jc w:val="both"/>
-        <w:rPr>
-          <w:cs/>
-        </w:rPr>
       </w:pPr>
       <w:r>
         <w:rPr>
           <w:cs/>
         </w:rPr>
         <w:lastRenderedPageBreak/>
-        <w:drawing>
-          <wp:inline distT="0" distB="0" distL="0" distR="0" wp14:anchorId="09187F5B" wp14:editId="0BDA6FDF">
-            <wp:extent cx="4625741" cy="4092295"/>
-            <wp:effectExtent l="0" t="0" r="3810" b="3810"/>
-            <wp:docPr id="285258731" name="Picture 1"/>
-            <wp:cNvGraphicFramePr>
-              <a:graphicFrameLocks xmlns:a="http://schemas.openxmlformats.org/drawingml/2006/main" noChangeAspect="1"/>
-            </wp:cNvGraphicFramePr>
-            <a:graphic xmlns:a="http://schemas.openxmlformats.org/drawingml/2006/main">
-              <a:graphicData uri="http://schemas.openxmlformats.org/drawingml/2006/picture">
-                <pic:pic xmlns:pic="http://schemas.openxmlformats.org/drawingml/2006/picture">
-                  <pic:nvPicPr>
-                    <pic:cNvPr id="285258731" name=""/>
-                    <pic:cNvPicPr/>
-                  </pic:nvPicPr>
-                  <pic:blipFill>
-                    <a:blip r:embed="rId4"/>
-                    <a:stretch>
-                      <a:fillRect/>
-                    </a:stretch>
-                  </pic:blipFill>
-                  <pic:spPr>
-                    <a:xfrm>
-                      <a:off x="0" y="0"/>
-                      <a:ext cx="4625741" cy="4092295"/>
-                    </a:xfrm>
-                    <a:prstGeom prst="rect">
-                      <a:avLst/>
-                    </a:prstGeom>
-                  </pic:spPr>
-                </pic:pic>
-              </a:graphicData>
-            </a:graphic>
-          </wp:inline>
-        </w:drawing>
+        <w:t xml:space="preserve">នៅក្នុងប្រព័ន្ធគ្រប់គ្រងអវត្តមានសិស្ស និងគ្រូបង្រៀននេះ មានមុខងាររៀបចំ និងផ្ញើរបាយការណ៍ទៅកាន់ </w:t>
+      </w:r>
+      <w:r>
+        <w:t xml:space="preserve">Telegram </w:t>
+      </w:r>
+      <w:r>
+        <w:rPr>
+          <w:cs/>
+        </w:rPr>
+        <w:t>យ៉ាងទូលំទូលាយ ទាំងការផ្ញើប្រចាំថ្ងៃ</w:t>
+      </w:r>
+      <w:r>
+        <w:t xml:space="preserve">, </w:t>
+      </w:r>
+      <w:r>
+        <w:rPr>
+          <w:cs/>
+        </w:rPr>
+        <w:t>ការផ្ញើតាមម៉ោងសិក្សា</w:t>
+      </w:r>
+      <w:r>
+        <w:t xml:space="preserve">, </w:t>
+      </w:r>
+      <w:r>
+        <w:rPr>
+          <w:cs/>
+        </w:rPr>
+        <w:t>និងការផ្ញើដោយស្វ័យប្រវត្តិតាមកាលវិភាគ។</w:t>
+      </w:r>
+    </w:p>
+    <w:p>
+      <w:pPr>
+        <w:jc w:val="both"/>
+      </w:pPr>
+      <w:r>
+        <w:rPr>
+          <w:cs/>
+        </w:rPr>
+        <w:t xml:space="preserve">ខាងក្រោមនេះជារបៀបកំណត់ និងបង្ហាញរបាយការណ៍សិស្ស-គ្រូតាម </w:t>
+      </w:r>
+      <w:r>
+        <w:t>Telegram</w:t>
+      </w:r>
+      <w:r>
+        <w:rPr>
+          <w:cs/>
+        </w:rPr>
+        <w:t>៖</w:t>
+      </w:r>
+    </w:p>
+    <w:p>
+      <w:pPr>
+        <w:jc w:val="both"/>
+      </w:pPr>
+      <w:r>
+        <w:pict w14:anchorId="676B432A">
+          <v:rect id="_x0000_i1085" style="width:336.3pt;height:.75pt" o:hrpct="0" o:hralign="center" o:hrstd="t" o:hr="t" fillcolor="#a0a0a0" stroked="f"/>
+        </w:pict>
+      </w:r>
+    </w:p>
+    <w:p>
+      <w:pPr>
+        <w:jc w:val="both"/>
+      </w:pPr>
+      <w:r>
+        <w:rPr>
+          <w:cs/>
+        </w:rPr>
+        <w:t xml:space="preserve">១. ការកំណត់ </w:t>
+      </w:r>
+      <w:r>
+        <w:t xml:space="preserve">Bot Token </w:t>
+      </w:r>
+      <w:r>
+        <w:rPr>
+          <w:cs/>
+        </w:rPr>
+        <w:t xml:space="preserve">និង </w:t>
+      </w:r>
+      <w:r>
+        <w:t>Chat ID (Configuration)</w:t>
+      </w:r>
+    </w:p>
+    <w:p>
+      <w:pPr>
+        <w:jc w:val="both"/>
+      </w:pPr>
+      <w:r>
+        <w:rPr>
+          <w:cs/>
+        </w:rPr>
+        <w:t xml:space="preserve">ដើម្បីឱ្យប្រព័ន្ធអាចផ្ញើសារទៅកាន់ </w:t>
+      </w:r>
+      <w:r>
+        <w:t xml:space="preserve">Telegram </w:t>
+      </w:r>
+      <w:r>
+        <w:rPr>
+          <w:cs/>
+        </w:rPr>
+        <w:t xml:space="preserve">បាន លោកអ្នកត្រូវកំណត់ </w:t>
+      </w:r>
+      <w:r>
+        <w:t xml:space="preserve">Chat ID </w:t>
+      </w:r>
+      <w:r>
+        <w:rPr>
+          <w:cs/>
+        </w:rPr>
+        <w:t xml:space="preserve">និង </w:t>
+      </w:r>
+      <w:r>
+        <w:t xml:space="preserve">Bot Token </w:t>
+      </w:r>
+      <w:r>
+        <w:rPr>
+          <w:cs/>
+        </w:rPr>
+        <w:t>ជាមុនសិន៖</w:t>
+      </w:r>
+    </w:p>
+    <w:p>
+      <w:pPr>
+        <w:numPr>
+          <w:ilvl w:val="0"/>
+          <w:numId w:val="1"/>
+        </w:numPr>
+        <w:jc w:val="both"/>
+      </w:pPr>
+      <w:r>
+        <w:rPr>
+          <w:cs/>
+        </w:rPr>
+        <w:t>ចូលទៅកាន់ម៉ឺនុយ</w:t>
+      </w:r>
+      <w:r>
+        <w:t> </w:t>
+      </w:r>
+      <w:r>
+        <w:rPr>
+          <w:b/>
+          <w:bCs/>
+          <w:cs/>
+        </w:rPr>
+        <w:t>ការកំណត់ប្រព័ន្ធ (</w:t>
+      </w:r>
+      <w:r>
+        <w:rPr>
+          <w:b/>
+          <w:bCs/>
+        </w:rPr>
+        <w:t>Settings)</w:t>
+      </w:r>
+      <w:r>
+        <w:t> </w:t>
+      </w:r>
+      <w:r>
+        <w:rPr>
+          <w:cs/>
+        </w:rPr>
+        <w:t>តាមរយៈ</w:t>
+      </w:r>
+      <w:r>
+        <w:t> http://localhost:5000/settings (</w:t>
+      </w:r>
+      <w:r>
+        <w:rPr>
+          <w:cs/>
+        </w:rPr>
+        <w:t>ឬចុចលើម៉ឺនុយ</w:t>
+      </w:r>
+      <w:r>
+        <w:t> </w:t>
+      </w:r>
+      <w:r>
+        <w:rPr>
+          <w:b/>
+          <w:bCs/>
+        </w:rPr>
+        <w:t>Settings</w:t>
+      </w:r>
+      <w:r>
+        <w:t>)</w:t>
+      </w:r>
+      <w:r>
+        <w:rPr>
+          <w:cs/>
+        </w:rPr>
+        <w:t>។</w:t>
+      </w:r>
+    </w:p>
+    <w:p>
+      <w:pPr>
+        <w:numPr>
+          <w:ilvl w:val="0"/>
+          <w:numId w:val="1"/>
+        </w:numPr>
+        <w:jc w:val="both"/>
+      </w:pPr>
+      <w:r>
+        <w:rPr>
+          <w:cs/>
+        </w:rPr>
+        <w:t>អូសចុះមកកាន់ផ្នែក</w:t>
+      </w:r>
+      <w:r>
+        <w:t> </w:t>
+      </w:r>
+      <w:r>
+        <w:rPr>
+          <w:b/>
+          <w:bCs/>
+        </w:rPr>
+        <w:t>"</w:t>
+      </w:r>
+      <w:r>
+        <w:rPr>
+          <w:b/>
+          <w:bCs/>
+          <w:cs/>
+        </w:rPr>
+        <w:t xml:space="preserve">ការបែងចែកគោលដៅ </w:t>
+      </w:r>
+      <w:r>
+        <w:rPr>
+          <w:b/>
+          <w:bCs/>
+        </w:rPr>
+        <w:t xml:space="preserve">Telegram </w:t>
+      </w:r>
+      <w:r>
+        <w:rPr>
+          <w:b/>
+          <w:bCs/>
+          <w:cs/>
+        </w:rPr>
+        <w:t>ដាច់ពីគ្នា (</w:t>
+      </w:r>
+      <w:r>
+        <w:rPr>
+          <w:b/>
+          <w:bCs/>
+        </w:rPr>
+        <w:t>Telegram Destination Routing)"</w:t>
+      </w:r>
+      <w:r>
+        <w:t> (</w:t>
+      </w:r>
+      <w:r>
+        <w:rPr>
+          <w:cs/>
+        </w:rPr>
+        <w:t>ឯកសារកូដ៖</w:t>
+      </w:r>
+      <w:r>
+        <w:t> </w:t>
+      </w:r>
+    </w:p>
+    <w:p>
+      <w:pPr>
+        <w:jc w:val="both"/>
+      </w:pPr>
+      <w:r>
+        <mc:AlternateContent>
+          <mc:Choice Requires="wps">
+            <w:drawing>
+              <wp:inline distT="0" distB="0" distL="0" distR="0" wp14:anchorId="18FC9FC4" wp14:editId="097922C6">
+                <wp:extent cx="304800" cy="304800"/>
+                <wp:effectExtent l="0" t="0" r="0" b="0"/>
+                <wp:docPr id="2041188786" name="Rectangle 12"/>
+                <wp:cNvGraphicFramePr>
+                  <a:graphicFrameLocks xmlns:a="http://schemas.openxmlformats.org/drawingml/2006/main" noChangeAspect="1"/>
+                </wp:cNvGraphicFramePr>
+                <a:graphic xmlns:a="http://schemas.openxmlformats.org/drawingml/2006/main">
+                  <a:graphicData uri="http://schemas.microsoft.com/office/word/2010/wordprocessingShape">
+                    <wps:wsp>
+                      <wps:cNvSpPr>
+                        <a:spLocks noChangeAspect="1" noChangeArrowheads="1"/>
+                      </wps:cNvSpPr>
+                      <wps:spPr bwMode="auto">
+                        <a:xfrm>
+                          <a:off x="0" y="0"/>
+                          <a:ext cx="304800" cy="304800"/>
+                        </a:xfrm>
+                        <a:prstGeom prst="rect">
+                          <a:avLst/>
+                        </a:prstGeom>
+                        <a:noFill/>
+                        <a:ln>
+                          <a:noFill/>
+                        </a:ln>
+                        <a:extLst>
+                          <a:ext uri="{909E8E84-426E-40DD-AFC4-6F175D3DCCD1}">
+                            <a14:hiddenFill xmlns:a14="http://schemas.microsoft.com/office/drawing/2010/main">
+                              <a:solidFill>
+                                <a:srgbClr val="FFFFFF"/>
+                              </a:solidFill>
+                            </a14:hiddenFill>
+                          </a:ext>
+                          <a:ext uri="{91240B29-F687-4F45-9708-019B960494DF}">
+                            <a14:hiddenLine xmlns:a14="http://schemas.microsoft.com/office/drawing/2010/main" w="9525">
+                              <a:solidFill>
+                                <a:srgbClr val="000000"/>
+                              </a:solidFill>
+                              <a:miter lim="800000"/>
+                              <a:headEnd/>
+                              <a:tailEnd/>
+                            </a14:hiddenLine>
+                          </a:ext>
+                        </a:extLst>
+                      </wps:spPr>
+                      <wps:bodyPr rot="0" vert="horz" wrap="square" lIns="91440" tIns="45720" rIns="91440" bIns="45720" anchor="t" anchorCtr="0" upright="1">
+                        <a:noAutofit/>
+                      </wps:bodyPr>
+                    </wps:wsp>
+                  </a:graphicData>
+                </a:graphic>
+              </wp:inline>
+            </w:drawing>
+          </mc:Choice>
+          <mc:Fallback>
+            <w:pict>
+              <v:rect w14:anchorId="695BEE42" id="Rectangle 12" o:spid="_x0000_s1026" style="width:24pt;height:24pt;visibility:visible;mso-wrap-style:square;mso-left-percent:-10001;mso-top-percent:-10001;mso-position-horizontal:absolute;mso-position-horizontal-relative:char;mso-position-vertical:absolute;mso-position-vertical-relative:line;mso-left-percent:-10001;mso-top-percent:-10001;v-text-anchor:top" o:gfxdata="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" filled="f" stroked="f">
+                <o:lock v:ext="edit" aspectratio="t"/>
+                <w10:anchorlock/>
+              </v:rect>
+            </w:pict>
+          </mc:Fallback>
+        </mc:AlternateContent>
+      </w:r>
+    </w:p>
+    <w:p>
+      <w:pPr>
+        <w:jc w:val="both"/>
+      </w:pPr>
+      <w:proofErr w:type="gramStart"/>
+      <w:r>
+        <w:t>settings.html)</w:t>
+      </w:r>
+      <w:r>
+        <w:rPr>
+          <w:cs/>
+        </w:rPr>
+        <w:t>៖</w:t>
+      </w:r>
+      <w:proofErr w:type="gramEnd"/>
+    </w:p>
+    <w:p>
+      <w:pPr>
+        <w:numPr>
+          <w:ilvl w:val="1"/>
+          <w:numId w:val="1"/>
+        </w:numPr>
+        <w:jc w:val="both"/>
+      </w:pPr>
+      <w:r>
+        <w:rPr>
+          <w:b/>
+          <w:bCs/>
+        </w:rPr>
+        <w:t>Telegram Bot Token</w:t>
+      </w:r>
+      <w:r>
+        <w:rPr>
+          <w:cs/>
+        </w:rPr>
+        <w:t xml:space="preserve">៖ យក </w:t>
+      </w:r>
+      <w:r>
+        <w:t xml:space="preserve">Token </w:t>
+      </w:r>
+      <w:r>
+        <w:rPr>
+          <w:cs/>
+        </w:rPr>
+        <w:t>ដែលបានបង្កើតជាមួយ</w:t>
+      </w:r>
+      <w:r>
+        <w:t> @BotFather </w:t>
+      </w:r>
+      <w:r>
+        <w:rPr>
+          <w:cs/>
+        </w:rPr>
+        <w:t xml:space="preserve">នៅលើ </w:t>
+      </w:r>
+      <w:r>
+        <w:t>Telegram (</w:t>
+      </w:r>
+      <w:r>
+        <w:rPr>
+          <w:cs/>
+        </w:rPr>
+        <w:t>ឧ.</w:t>
+      </w:r>
+      <w:r>
+        <w:t> </w:t>
+      </w:r>
+      <w:proofErr w:type="gramStart"/>
+      <w:r>
+        <w:t>123456789:ABCdefGhI...)</w:t>
+      </w:r>
+      <w:r>
+        <w:rPr>
+          <w:cs/>
+        </w:rPr>
+        <w:t>។</w:t>
+      </w:r>
+      <w:proofErr w:type="gramEnd"/>
+    </w:p>
+    <w:p>
+      <w:pPr>
+        <w:numPr>
+          <w:ilvl w:val="1"/>
+          <w:numId w:val="1"/>
+        </w:numPr>
+        <w:jc w:val="both"/>
+      </w:pPr>
+      <w:r>
+        <w:rPr>
+          <w:b/>
+          <w:bCs/>
+        </w:rPr>
+        <w:t>Telegram Admin Chat ID (</w:t>
+      </w:r>
+      <w:r>
+        <w:rPr>
+          <w:b/>
+          <w:bCs/>
+          <w:cs/>
+        </w:rPr>
+        <w:t xml:space="preserve">មេ / </w:t>
+      </w:r>
+      <w:proofErr w:type="gramStart"/>
+      <w:r>
+        <w:rPr>
+          <w:b/>
+          <w:bCs/>
+        </w:rPr>
+        <w:t>Fallback)</w:t>
+      </w:r>
+      <w:r>
+        <w:rPr>
+          <w:cs/>
+        </w:rPr>
+        <w:t>៖</w:t>
+      </w:r>
+      <w:proofErr w:type="gramEnd"/>
+      <w:r>
+        <w:rPr>
+          <w:cs/>
+        </w:rPr>
+        <w:t xml:space="preserve"> </w:t>
+      </w:r>
+      <w:r>
+        <w:t xml:space="preserve">Chat ID </w:t>
+      </w:r>
+      <w:r>
+        <w:rPr>
+          <w:cs/>
+        </w:rPr>
+        <w:t xml:space="preserve">របស់ </w:t>
+      </w:r>
+      <w:r>
+        <w:t xml:space="preserve">Admin </w:t>
+      </w:r>
+      <w:r>
+        <w:rPr>
+          <w:cs/>
+        </w:rPr>
+        <w:t xml:space="preserve">ឬ </w:t>
+      </w:r>
+      <w:r>
+        <w:t xml:space="preserve">Group Telegram </w:t>
+      </w:r>
+      <w:r>
+        <w:rPr>
+          <w:cs/>
+        </w:rPr>
+        <w:t xml:space="preserve">រួម (អាចយកតាមរយៈ </w:t>
+      </w:r>
+      <w:r>
+        <w:t xml:space="preserve">bot </w:t>
+      </w:r>
+      <w:r>
+        <w:rPr>
+          <w:cs/>
+        </w:rPr>
+        <w:t>ដូចជា</w:t>
+      </w:r>
+      <w:r>
+        <w:t> @userinfobot </w:t>
+      </w:r>
+      <w:r>
+        <w:rPr>
+          <w:cs/>
+        </w:rPr>
+        <w:t>ឬ</w:t>
+      </w:r>
+      <w:r>
+        <w:t> @getmyid_bot </w:t>
+      </w:r>
+      <w:r>
+        <w:rPr>
+          <w:cs/>
+        </w:rPr>
+        <w:t xml:space="preserve">ដោយ </w:t>
+      </w:r>
+      <w:r>
+        <w:t xml:space="preserve">Group ID </w:t>
+      </w:r>
+      <w:r>
+        <w:rPr>
+          <w:cs/>
+        </w:rPr>
+        <w:t>ច្រើនផ្ដើមដោយសញ្ញាដក ឧ.</w:t>
+      </w:r>
+      <w:r>
+        <w:t> -</w:t>
+      </w:r>
+      <w:proofErr w:type="gramStart"/>
+      <w:r>
+        <w:t>100123456789)</w:t>
+      </w:r>
+      <w:r>
+        <w:rPr>
+          <w:cs/>
+        </w:rPr>
+        <w:t>។</w:t>
+      </w:r>
+      <w:proofErr w:type="gramEnd"/>
+    </w:p>
+    <w:p>
+      <w:pPr>
+        <w:numPr>
+          <w:ilvl w:val="1"/>
+          <w:numId w:val="1"/>
+        </w:numPr>
+        <w:jc w:val="both"/>
+      </w:pPr>
+      <w:r>
+        <w:rPr>
+          <w:b/>
+          <w:bCs/>
+        </w:rPr>
+        <w:t xml:space="preserve">Telegram Chat ID </w:t>
+      </w:r>
+      <w:r>
+        <w:rPr>
+          <w:b/>
+          <w:bCs/>
+          <w:cs/>
+        </w:rPr>
+        <w:t>របាយការណ៍សិស្សប្រចាំថ្ងៃ</w:t>
+      </w:r>
+      <w:r>
+        <w:rPr>
+          <w:cs/>
+        </w:rPr>
+        <w:t xml:space="preserve">៖ </w:t>
+      </w:r>
+      <w:r>
+        <w:t xml:space="preserve">Chat ID </w:t>
+      </w:r>
+      <w:r>
+        <w:rPr>
+          <w:cs/>
+        </w:rPr>
+        <w:t xml:space="preserve">ឬ </w:t>
+      </w:r>
+      <w:r>
+        <w:t xml:space="preserve">Group ID </w:t>
+      </w:r>
+      <w:r>
+        <w:rPr>
+          <w:cs/>
+        </w:rPr>
+        <w:t>សម្រាប់ទទួលរបាយការណ៍សិស្ស។</w:t>
+      </w:r>
+    </w:p>
+    <w:p>
+      <w:pPr>
+        <w:numPr>
+          <w:ilvl w:val="1"/>
+          <w:numId w:val="1"/>
+        </w:numPr>
+        <w:jc w:val="both"/>
+      </w:pPr>
+      <w:r>
+        <w:rPr>
+          <w:b/>
+          <w:bCs/>
+        </w:rPr>
+        <w:lastRenderedPageBreak/>
+        <w:t xml:space="preserve">Telegram Chat ID </w:t>
+      </w:r>
+      <w:r>
+        <w:rPr>
+          <w:b/>
+          <w:bCs/>
+          <w:cs/>
+        </w:rPr>
+        <w:t>របាយការណ៍គ្រូប្រចាំថ្ងៃ</w:t>
+      </w:r>
+      <w:r>
+        <w:rPr>
+          <w:cs/>
+        </w:rPr>
+        <w:t xml:space="preserve">៖ </w:t>
+      </w:r>
+      <w:r>
+        <w:t xml:space="preserve">Chat ID </w:t>
+      </w:r>
+      <w:r>
+        <w:rPr>
+          <w:cs/>
+        </w:rPr>
+        <w:t xml:space="preserve">ឬ </w:t>
+      </w:r>
+      <w:r>
+        <w:t xml:space="preserve">Group ID </w:t>
+      </w:r>
+      <w:r>
+        <w:rPr>
+          <w:cs/>
+        </w:rPr>
+        <w:t>សម្រាប់ទទួលរបាយការណ៍គ្រូបង្រៀន។</w:t>
+      </w:r>
+    </w:p>
+    <w:p>
+      <w:pPr>
+        <w:numPr>
+          <w:ilvl w:val="1"/>
+          <w:numId w:val="1"/>
+        </w:numPr>
+        <w:jc w:val="both"/>
+      </w:pPr>
+      <w:r>
+        <w:rPr>
+          <w:b/>
+          <w:bCs/>
+        </w:rPr>
+        <w:t xml:space="preserve">Telegram </w:t>
+      </w:r>
+      <w:r>
+        <w:rPr>
+          <w:b/>
+          <w:bCs/>
+          <w:cs/>
+        </w:rPr>
+        <w:t>គ្រូខកខានមិនបានស្រង់វត្តមាន</w:t>
+      </w:r>
+      <w:r>
+        <w:rPr>
+          <w:cs/>
+        </w:rPr>
+        <w:t>៖ សម្រាប់ទទួលការព្រមានបន្ទាន់ពេលគ្រូមិនបានស្រង់វត្តមានលើស ២៥-៣០ នាទី។</w:t>
+      </w:r>
+    </w:p>
+    <w:p>
+      <w:pPr>
+        <w:numPr>
+          <w:ilvl w:val="1"/>
+          <w:numId w:val="1"/>
+        </w:numPr>
+        <w:jc w:val="both"/>
+      </w:pPr>
+      <w:r>
+        <w:rPr>
+          <w:b/>
+          <w:bCs/>
+        </w:rPr>
+        <w:t xml:space="preserve">Telegram </w:t>
+      </w:r>
+      <w:r>
+        <w:rPr>
+          <w:b/>
+          <w:bCs/>
+          <w:cs/>
+        </w:rPr>
+        <w:t>គណៈគ្រប់គ្រងអនុម័តច្បាប់</w:t>
+      </w:r>
+      <w:r>
+        <w:rPr>
+          <w:cs/>
+        </w:rPr>
+        <w:t>៖ សម្រាប់ទទួលពាក្យសុំច្បាប់ដែលមានប៊ូតុងចុច</w:t>
+      </w:r>
+      <w:r>
+        <w:t> [</w:t>
+      </w:r>
+      <w:r>
+        <w:rPr>
+          <w:rFonts w:ascii="Segoe UI Emoji" w:hAnsi="Segoe UI Emoji" w:cs="Segoe UI Emoji"/>
+        </w:rPr>
+        <w:t>✅</w:t>
+      </w:r>
+      <w:r>
+        <w:t xml:space="preserve"> </w:t>
+      </w:r>
+      <w:r>
+        <w:rPr>
+          <w:cs/>
+        </w:rPr>
+        <w:t>អនុម័ត]</w:t>
+      </w:r>
+      <w:r>
+        <w:t> </w:t>
+      </w:r>
+      <w:r>
+        <w:rPr>
+          <w:cs/>
+        </w:rPr>
+        <w:t>ឬ</w:t>
+      </w:r>
+      <w:r>
+        <w:t> [</w:t>
+      </w:r>
+      <w:r>
+        <w:rPr>
+          <w:rFonts w:ascii="Segoe UI Emoji" w:hAnsi="Segoe UI Emoji" w:cs="Segoe UI Emoji"/>
+        </w:rPr>
+        <w:t>❌</w:t>
+      </w:r>
+      <w:r>
+        <w:t xml:space="preserve"> </w:t>
+      </w:r>
+      <w:r>
+        <w:rPr>
+          <w:cs/>
+        </w:rPr>
+        <w:t>បដិសេធ]</w:t>
+      </w:r>
+      <w:r>
+        <w:t> </w:t>
+      </w:r>
+      <w:r>
+        <w:rPr>
+          <w:cs/>
+        </w:rPr>
+        <w:t xml:space="preserve">ផ្ទាល់លើ </w:t>
+      </w:r>
+      <w:r>
+        <w:t>Telegram</w:t>
+      </w:r>
+      <w:r>
+        <w:rPr>
+          <w:cs/>
+        </w:rPr>
+        <w:t>។</w:t>
+      </w:r>
+    </w:p>
+    <w:p>
+      <w:pPr>
+        <w:numPr>
+          <w:ilvl w:val="0"/>
+          <w:numId w:val="1"/>
+        </w:numPr>
+        <w:jc w:val="both"/>
+      </w:pPr>
+      <w:r>
+        <w:rPr>
+          <w:cs/>
+        </w:rPr>
+        <w:t>ធីកបើកមុខងារផ្ញើដំណឹង៖</w:t>
+      </w:r>
+    </w:p>
+    <w:p>
+      <w:pPr>
+        <w:numPr>
+          <w:ilvl w:val="1"/>
+          <w:numId w:val="1"/>
+        </w:numPr>
+        <w:jc w:val="both"/>
+      </w:pPr>
+      <w:r>
+        <w:rPr>
+          <w:rFonts w:ascii="Segoe UI Emoji" w:hAnsi="Segoe UI Emoji" w:cs="Segoe UI Emoji"/>
+        </w:rPr>
+        <w:t>☑️</w:t>
+      </w:r>
+      <w:r>
+        <w:t> </w:t>
+      </w:r>
+      <w:r>
+        <w:rPr>
+          <w:i/>
+          <w:iCs/>
+          <w:cs/>
+        </w:rPr>
+        <w:t xml:space="preserve">បើកដំណើរការផ្ញើដំណឹងអវត្តមានទៅ </w:t>
+      </w:r>
+      <w:r>
+        <w:rPr>
+          <w:i/>
+          <w:iCs/>
+        </w:rPr>
+        <w:t>Telegram</w:t>
+      </w:r>
+    </w:p>
+    <w:p>
+      <w:pPr>
+        <w:numPr>
+          <w:ilvl w:val="1"/>
+          <w:numId w:val="1"/>
+        </w:numPr>
+        <w:jc w:val="both"/>
+      </w:pPr>
+      <w:r>
+        <w:rPr>
+          <w:rFonts w:ascii="Segoe UI Emoji" w:hAnsi="Segoe UI Emoji" w:cs="Segoe UI Emoji"/>
+        </w:rPr>
+        <w:t>☑️</w:t>
+      </w:r>
+      <w:r>
+        <w:t> </w:t>
+      </w:r>
+      <w:r>
+        <w:rPr>
+          <w:i/>
+          <w:iCs/>
+          <w:cs/>
+        </w:rPr>
+        <w:t xml:space="preserve">ផ្ញើដំណឹងអវត្តមានទៅ </w:t>
+      </w:r>
+      <w:r>
+        <w:rPr>
+          <w:i/>
+          <w:iCs/>
+        </w:rPr>
+        <w:t xml:space="preserve">Telegram </w:t>
+      </w:r>
+      <w:r>
+        <w:rPr>
+          <w:i/>
+          <w:iCs/>
+          <w:cs/>
+        </w:rPr>
+        <w:t>អាណាព្យាបាល</w:t>
+      </w:r>
+    </w:p>
+    <w:p>
+      <w:pPr>
+        <w:numPr>
+          <w:ilvl w:val="1"/>
+          <w:numId w:val="1"/>
+        </w:numPr>
+        <w:jc w:val="both"/>
+      </w:pPr>
+      <w:r>
+        <w:rPr>
+          <w:rFonts w:ascii="Segoe UI Emoji" w:hAnsi="Segoe UI Emoji" w:cs="Segoe UI Emoji"/>
+        </w:rPr>
+        <w:t>☑️</w:t>
+      </w:r>
+      <w:r>
+        <w:t> </w:t>
+      </w:r>
+      <w:r>
+        <w:rPr>
+          <w:i/>
+          <w:iCs/>
+          <w:cs/>
+        </w:rPr>
+        <w:t xml:space="preserve">ផ្ញើបញ្ជីអវត្តមានតាមម៉ោងទៅ </w:t>
+      </w:r>
+      <w:r>
+        <w:rPr>
+          <w:i/>
+          <w:iCs/>
+        </w:rPr>
+        <w:t xml:space="preserve">Telegram Group </w:t>
+      </w:r>
+      <w:r>
+        <w:rPr>
+          <w:i/>
+          <w:iCs/>
+          <w:cs/>
+        </w:rPr>
+        <w:t>គ្រូបន្ទុកថ្នាក់</w:t>
+      </w:r>
+    </w:p>
+    <w:p>
+      <w:pPr>
+        <w:numPr>
+          <w:ilvl w:val="0"/>
+          <w:numId w:val="1"/>
+        </w:numPr>
+        <w:jc w:val="both"/>
+      </w:pPr>
+      <w:r>
+        <w:rPr>
+          <w:cs/>
+        </w:rPr>
+        <w:t>ចុចប៊ូតុង</w:t>
+      </w:r>
+      <w:r>
+        <w:t> </w:t>
+      </w:r>
+      <w:r>
+        <w:rPr>
+          <w:b/>
+          <w:bCs/>
+          <w:cs/>
+        </w:rPr>
+        <w:t xml:space="preserve">រក្សាទុកការកំណត់ </w:t>
+      </w:r>
+      <w:r>
+        <w:rPr>
+          <w:b/>
+          <w:bCs/>
+        </w:rPr>
+        <w:t>Telegram</w:t>
+      </w:r>
+      <w:r>
+        <w:rPr>
+          <w:cs/>
+        </w:rPr>
+        <w:t>។</w:t>
+      </w:r>
+    </w:p>
+    <w:p>
+      <w:pPr>
+        <w:jc w:val="both"/>
+      </w:pPr>
+      <w:r>
+        <w:pict w14:anchorId="2E89DF32">
+          <v:rect id="_x0000_i1087" style="width:336.3pt;height:.75pt" o:hrpct="0" o:hralign="center" o:hrstd="t" o:hr="t" fillcolor="#a0a0a0" stroked="f"/>
+        </w:pict>
+      </w:r>
+    </w:p>
+    <w:p>
+      <w:pPr>
+        <w:jc w:val="both"/>
+      </w:pPr>
+      <w:r>
+        <w:rPr>
+          <w:cs/>
+        </w:rPr>
+        <w:t>២. របៀបបញ្ជាឱ្យផ្ញើរបាយការណ៍ភ្លាមៗ (</w:t>
+      </w:r>
+      <w:r>
+        <w:t>Manual Trigger)</w:t>
+      </w:r>
+    </w:p>
+    <w:p>
+      <w:pPr>
+        <w:jc w:val="both"/>
+      </w:pPr>
+      <w:r>
+        <w:rPr>
+          <w:cs/>
+        </w:rPr>
+        <w:t xml:space="preserve">នៅត្រង់ផ្នែក </w:t>
+      </w:r>
+      <w:r>
+        <w:t xml:space="preserve">Telegram </w:t>
+      </w:r>
+      <w:r>
+        <w:rPr>
+          <w:cs/>
+        </w:rPr>
+        <w:t>ក្នុងទំព័រ</w:t>
+      </w:r>
+      <w:r>
+        <w:t> </w:t>
+      </w:r>
+      <w:r>
+        <w:rPr>
+          <w:b/>
+          <w:bCs/>
+        </w:rPr>
+        <w:t>Settings</w:t>
+      </w:r>
+      <w:r>
+        <w:t> </w:t>
+      </w:r>
+      <w:r>
+        <w:rPr>
+          <w:cs/>
+        </w:rPr>
+        <w:t>ដដែល មានប៊ូតុងតេស្ត និងបញ្ជាឱ្យផ្ញើភ្លាមៗ៖</w:t>
+      </w:r>
+    </w:p>
+    <w:p>
+      <w:pPr>
+        <w:numPr>
+          <w:ilvl w:val="0"/>
+          <w:numId w:val="2"/>
+        </w:numPr>
+        <w:jc w:val="both"/>
+      </w:pPr>
+      <w:r>
+        <w:rPr>
+          <w:b/>
+          <w:bCs/>
+          <w:cs/>
+        </w:rPr>
+        <w:t xml:space="preserve">ប៊ូតុង "តេស្តផ្ញើសារ </w:t>
+      </w:r>
+      <w:r>
+        <w:rPr>
+          <w:b/>
+          <w:bCs/>
+        </w:rPr>
+        <w:t>Bot"</w:t>
+      </w:r>
+      <w:r>
+        <w:rPr>
+          <w:cs/>
+        </w:rPr>
+        <w:t xml:space="preserve">៖ សម្រាប់តេស្តមើលថាតើ </w:t>
+      </w:r>
+      <w:r>
+        <w:t xml:space="preserve">Bot Token </w:t>
+      </w:r>
+      <w:r>
+        <w:rPr>
+          <w:cs/>
+        </w:rPr>
+        <w:t xml:space="preserve">និង </w:t>
+      </w:r>
+      <w:r>
+        <w:t xml:space="preserve">Admin Chat ID </w:t>
+      </w:r>
+      <w:r>
+        <w:rPr>
+          <w:cs/>
+        </w:rPr>
+        <w:t>ដំណើរការជោគជ័យឬនៅ។</w:t>
+      </w:r>
+    </w:p>
+    <w:p>
+      <w:pPr>
+        <w:numPr>
+          <w:ilvl w:val="0"/>
+          <w:numId w:val="2"/>
+        </w:numPr>
+        <w:jc w:val="both"/>
+      </w:pPr>
+      <w:r>
+        <w:rPr>
+          <w:b/>
+          <w:bCs/>
+          <w:cs/>
+        </w:rPr>
+        <w:t>ប៊ូតុង "តេស្តផ្ញើរបាយការណ៍សិស្ស"</w:t>
+      </w:r>
+      <w:r>
+        <w:rPr>
+          <w:cs/>
+        </w:rPr>
+        <w:t xml:space="preserve">៖ បញ្ជាឱ្យប្រព័ន្ធទាញទិន្នន័យអវត្តមានសិស្សថ្ងៃនេះ ហើយផ្ញើទៅ </w:t>
+      </w:r>
+      <w:r>
+        <w:t xml:space="preserve">Telegram </w:t>
+      </w:r>
+      <w:r>
+        <w:rPr>
+          <w:cs/>
+        </w:rPr>
+        <w:t>សិស្សភ្លាមៗ។</w:t>
+      </w:r>
+    </w:p>
+    <w:p>
+      <w:pPr>
+        <w:numPr>
+          <w:ilvl w:val="0"/>
+          <w:numId w:val="2"/>
+        </w:numPr>
+        <w:jc w:val="both"/>
+      </w:pPr>
+      <w:r>
+        <w:rPr>
+          <w:b/>
+          <w:bCs/>
+          <w:cs/>
+        </w:rPr>
+        <w:t>ប៊ូតុង "តេស្តផ្ញើរបាយការណ៍គ្រូ"</w:t>
+      </w:r>
+      <w:r>
+        <w:rPr>
+          <w:cs/>
+        </w:rPr>
+        <w:t xml:space="preserve">៖ បញ្ជាឱ្យប្រព័ន្ធទាញទិន្នន័យអវត្តមាន និងច្បាប់ឈប់សម្រាករបស់គ្រូថ្ងៃនេះ ហើយផ្ញើទៅ </w:t>
+      </w:r>
+      <w:r>
+        <w:t xml:space="preserve">Telegram </w:t>
+      </w:r>
+      <w:r>
+        <w:rPr>
+          <w:cs/>
+        </w:rPr>
+        <w:t>គ្រូភ្លាមៗ។</w:t>
+      </w:r>
+    </w:p>
+    <w:p>
+      <w:pPr>
+        <w:numPr>
+          <w:ilvl w:val="0"/>
+          <w:numId w:val="2"/>
+        </w:numPr>
+        <w:jc w:val="both"/>
+      </w:pPr>
+      <w:r>
+        <w:rPr>
+          <w:b/>
+          <w:bCs/>
+          <w:cs/>
+        </w:rPr>
+        <w:t>ប៊ូតុង "តេស្តឆែកម៉ោងសិក្សា"</w:t>
+      </w:r>
+      <w:r>
+        <w:rPr>
+          <w:cs/>
+        </w:rPr>
+        <w:t>៖ ដំណើរការឆែកម៉ោងបង្រៀនបច្ចុប្បន្ន ថាតើមានគ្រូណាខកខានមិនទាន់ស្រង់វត្តមានសិស្សឬទេ។</w:t>
+      </w:r>
+    </w:p>
+    <w:p>
+      <w:pPr>
+        <w:jc w:val="both"/>
+        <w:rPr>
+          <w:i/>
+          <w:iCs/>
+        </w:rPr>
+      </w:pPr>
+      <w:r>
+        <w:rPr>
+          <w:i/>
+          <w:iCs/>
+        </w:rPr>
+        <w:lastRenderedPageBreak/>
+        <w:t>(</w:t>
+      </w:r>
+      <w:r>
+        <w:rPr>
+          <w:i/>
+          <w:iCs/>
+          <w:cs/>
+        </w:rPr>
+        <w:t xml:space="preserve">ដំណើរការតាមរយៈ </w:t>
+      </w:r>
+      <w:r>
+        <w:rPr>
+          <w:i/>
+          <w:iCs/>
+        </w:rPr>
+        <w:t>API Endpoint POST /</w:t>
+      </w:r>
+      <w:proofErr w:type="spellStart"/>
+      <w:r>
+        <w:rPr>
+          <w:i/>
+          <w:iCs/>
+        </w:rPr>
+        <w:t>api</w:t>
+      </w:r>
+      <w:proofErr w:type="spellEnd"/>
+      <w:r>
+        <w:rPr>
+          <w:i/>
+          <w:iCs/>
+        </w:rPr>
+        <w:t>/telegram/send-daily-report </w:t>
+      </w:r>
+      <w:r>
+        <w:rPr>
+          <w:i/>
+          <w:iCs/>
+          <w:cs/>
+        </w:rPr>
+        <w:t>ក្នុង</w:t>
+      </w:r>
+      <w:r>
+        <w:rPr>
+          <w:i/>
+          <w:iCs/>
+        </w:rPr>
+        <w:t> </w:t>
+      </w:r>
+    </w:p>
+    <w:p>
+      <w:pPr>
+        <w:jc w:val="both"/>
+      </w:pPr>
+      <w:r>
+        <w:rPr>
+          <w:i/>
+          <w:iCs/>
+        </w:rPr>
+        <mc:AlternateContent>
+          <mc:Choice Requires="wps">
+            <w:drawing>
+              <wp:inline distT="0" distB="0" distL="0" distR="0" wp14:anchorId="7A445575" wp14:editId="37F29743">
+                <wp:extent cx="304800" cy="304800"/>
+                <wp:effectExtent l="0" t="0" r="0" b="0"/>
+                <wp:docPr id="819112719" name="Rectangle 11"/>
+                <wp:cNvGraphicFramePr>
+                  <a:graphicFrameLocks xmlns:a="http://schemas.openxmlformats.org/drawingml/2006/main" noChangeAspect="1"/>
+                </wp:cNvGraphicFramePr>
+                <a:graphic xmlns:a="http://schemas.openxmlformats.org/drawingml/2006/main">
+                  <a:graphicData uri="http://schemas.microsoft.com/office/word/2010/wordprocessingShape">
+                    <wps:wsp>
+                      <wps:cNvSpPr>
+                        <a:spLocks noChangeAspect="1" noChangeArrowheads="1"/>
+                      </wps:cNvSpPr>
+                      <wps:spPr bwMode="auto">
+                        <a:xfrm>
+                          <a:off x="0" y="0"/>
+                          <a:ext cx="304800" cy="304800"/>
+                        </a:xfrm>
+                        <a:prstGeom prst="rect">
+                          <a:avLst/>
+                        </a:prstGeom>
+                        <a:noFill/>
+                        <a:ln>
+                          <a:noFill/>
+                        </a:ln>
+                        <a:extLst>
+                          <a:ext uri="{909E8E84-426E-40DD-AFC4-6F175D3DCCD1}">
+                            <a14:hiddenFill xmlns:a14="http://schemas.microsoft.com/office/drawing/2010/main">
+                              <a:solidFill>
+                                <a:srgbClr val="FFFFFF"/>
+                              </a:solidFill>
+                            </a14:hiddenFill>
+                          </a:ext>
+                          <a:ext uri="{91240B29-F687-4F45-9708-019B960494DF}">
+                            <a14:hiddenLine xmlns:a14="http://schemas.microsoft.com/office/drawing/2010/main" w="9525">
+                              <a:solidFill>
+                                <a:srgbClr val="000000"/>
+                              </a:solidFill>
+                              <a:miter lim="800000"/>
+                              <a:headEnd/>
+                              <a:tailEnd/>
+                            </a14:hiddenLine>
+                          </a:ext>
+                        </a:extLst>
+                      </wps:spPr>
+                      <wps:bodyPr rot="0" vert="horz" wrap="square" lIns="91440" tIns="45720" rIns="91440" bIns="45720" anchor="t" anchorCtr="0" upright="1">
+                        <a:noAutofit/>
+                      </wps:bodyPr>
+                    </wps:wsp>
+                  </a:graphicData>
+                </a:graphic>
+              </wp:inline>
+            </w:drawing>
+          </mc:Choice>
+          <mc:Fallback>
+            <w:pict>
+              <v:rect w14:anchorId="414CE9C5" id="Rectangle 11" o:spid="_x0000_s1026" style="width:24pt;height:24pt;visibility:visible;mso-wrap-style:square;mso-left-percent:-10001;mso-top-percent:-10001;mso-position-horizontal:absolute;mso-position-horizontal-relative:char;mso-position-vertical:absolute;mso-position-vertical-relative:line;mso-left-percent:-10001;mso-top-percent:-10001;v-text-anchor:top" o:gfxdata="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" filled="f" stroked="f">
+                <o:lock v:ext="edit" aspectratio="t"/>
+                <w10:anchorlock/>
+              </v:rect>
+            </w:pict>
+          </mc:Fallback>
+        </mc:AlternateContent>
+      </w:r>
+    </w:p>
+    <w:p>
+      <w:pPr>
+        <w:jc w:val="both"/>
+      </w:pPr>
+      <w:r>
+        <w:rPr>
+          <w:i/>
+          <w:iCs/>
+        </w:rPr>
+        <w:t>app.py)</w:t>
+      </w:r>
+    </w:p>
+    <w:p>
+      <w:pPr>
+        <w:jc w:val="both"/>
+      </w:pPr>
+      <w:r>
+        <w:pict w14:anchorId="2A8F509B">
+          <v:rect id="_x0000_i1089" style="width:336.3pt;height:.75pt" o:hrpct="0" o:hralign="center" o:hrstd="t" o:hr="t" fillcolor="#a0a0a0" stroked="f"/>
+        </w:pict>
+      </w:r>
+    </w:p>
+    <w:p>
+      <w:pPr>
+        <w:jc w:val="both"/>
+      </w:pPr>
+      <w:r>
+        <w:rPr>
+          <w:cs/>
+        </w:rPr>
+        <w:t>៣. ការកំណត់ឱ្យផ្ញើរបាយការណ៍ស្វ័យប្រវត្តិតាមម៉ោងកំណត់ (</w:t>
+      </w:r>
+      <w:r>
+        <w:t>Automated Daily Dispatch)</w:t>
+      </w:r>
+    </w:p>
+    <w:p>
+      <w:pPr>
+        <w:jc w:val="both"/>
+      </w:pPr>
+      <w:r>
+        <w:rPr>
+          <w:cs/>
+        </w:rPr>
+        <w:t xml:space="preserve">ប្រព័ន្ធមាន </w:t>
+      </w:r>
+      <w:r>
+        <w:t xml:space="preserve">Background Worker </w:t>
+      </w:r>
+      <w:r>
+        <w:rPr>
+          <w:cs/>
+        </w:rPr>
+        <w:t>ដំណើរការរៀងរាល់ ៦០ វិនាទី (ក្នុង</w:t>
+      </w:r>
+      <w:r>
+        <w:t> </w:t>
+      </w:r>
+    </w:p>
+    <w:p>
+      <w:pPr>
+        <w:jc w:val="both"/>
+      </w:pPr>
+      <w:r>
+        <mc:AlternateContent>
+          <mc:Choice Requires="wps">
+            <w:drawing>
+              <wp:inline distT="0" distB="0" distL="0" distR="0" wp14:anchorId="571421C0" wp14:editId="1154C0BE">
+                <wp:extent cx="304800" cy="304800"/>
+                <wp:effectExtent l="0" t="0" r="0" b="0"/>
+                <wp:docPr id="1257751508" name="Rectangle 10"/>
+                <wp:cNvGraphicFramePr>
+                  <a:graphicFrameLocks xmlns:a="http://schemas.openxmlformats.org/drawingml/2006/main" noChangeAspect="1"/>
+                </wp:cNvGraphicFramePr>
+                <a:graphic xmlns:a="http://schemas.openxmlformats.org/drawingml/2006/main">
+                  <a:graphicData uri="http://schemas.microsoft.com/office/word/2010/wordprocessingShape">
+                    <wps:wsp>
+                      <wps:cNvSpPr>
+                        <a:spLocks noChangeAspect="1" noChangeArrowheads="1"/>
+                      </wps:cNvSpPr>
+                      <wps:spPr bwMode="auto">
+                        <a:xfrm>
+                          <a:off x="0" y="0"/>
+                          <a:ext cx="304800" cy="304800"/>
+                        </a:xfrm>
+                        <a:prstGeom prst="rect">
+                          <a:avLst/>
+                        </a:prstGeom>
+                        <a:noFill/>
+                        <a:ln>
+                          <a:noFill/>
+                        </a:ln>
+                        <a:extLst>
+                          <a:ext uri="{909E8E84-426E-40DD-AFC4-6F175D3DCCD1}">
+                            <a14:hiddenFill xmlns:a14="http://schemas.microsoft.com/office/drawing/2010/main">
+                              <a:solidFill>
+                                <a:srgbClr val="FFFFFF"/>
+                              </a:solidFill>
+                            </a14:hiddenFill>
+                          </a:ext>
+                          <a:ext uri="{91240B29-F687-4F45-9708-019B960494DF}">
+                            <a14:hiddenLine xmlns:a14="http://schemas.microsoft.com/office/drawing/2010/main" w="9525">
+                              <a:solidFill>
+                                <a:srgbClr val="000000"/>
+                              </a:solidFill>
+                              <a:miter lim="800000"/>
+                              <a:headEnd/>
+                              <a:tailEnd/>
+                            </a14:hiddenLine>
+                          </a:ext>
+                        </a:extLst>
+                      </wps:spPr>
+                      <wps:bodyPr rot="0" vert="horz" wrap="square" lIns="91440" tIns="45720" rIns="91440" bIns="45720" anchor="t" anchorCtr="0" upright="1">
+                        <a:noAutofit/>
+                      </wps:bodyPr>
+                    </wps:wsp>
+                  </a:graphicData>
+                </a:graphic>
+              </wp:inline>
+            </w:drawing>
+          </mc:Choice>
+          <mc:Fallback>
+            <w:pict>
+              <v:rect w14:anchorId="36C2EF57" id="Rectangle 10" o:spid="_x0000_s1026" style="width:24pt;height:24pt;visibility:visible;mso-wrap-style:square;mso-left-percent:-10001;mso-top-percent:-10001;mso-position-horizontal:absolute;mso-position-horizontal-relative:char;mso-position-vertical:absolute;mso-position-vertical-relative:line;mso-left-percent:-10001;mso-top-percent:-10001;v-text-anchor:top" o:gfxdata="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" filled="f" stroked="f">
+                <o:lock v:ext="edit" aspectratio="t"/>
+                <w10:anchorlock/>
+              </v:rect>
+            </w:pict>
+          </mc:Fallback>
+        </mc:AlternateContent>
+      </w:r>
+    </w:p>
+    <w:p>
+      <w:pPr>
+        <w:jc w:val="both"/>
+      </w:pPr>
+      <w:r>
+        <w:t xml:space="preserve">app.py) </w:t>
+      </w:r>
+      <w:r>
+        <w:rPr>
+          <w:cs/>
+        </w:rPr>
+        <w:t>ដែលអាចផ្ញើរបាយការណ៍ទាំងសិស្ស និងគ្រូដោយស្វ័យប្រវត្តិ៖</w:t>
+      </w:r>
+    </w:p>
+    <w:p>
+      <w:pPr>
+        <w:numPr>
+          <w:ilvl w:val="0"/>
+          <w:numId w:val="3"/>
+        </w:numPr>
+        <w:jc w:val="both"/>
+      </w:pPr>
+      <w:r>
+        <w:rPr>
+          <w:cs/>
+        </w:rPr>
+        <w:t>នៅទំព័រ</w:t>
+      </w:r>
+      <w:r>
+        <w:t> </w:t>
+      </w:r>
+      <w:r>
+        <w:rPr>
+          <w:b/>
+          <w:bCs/>
+        </w:rPr>
+        <w:t>Settings</w:t>
+      </w:r>
+      <w:r>
+        <w:t> </w:t>
+      </w:r>
+      <w:r>
+        <w:rPr>
+          <w:cs/>
+        </w:rPr>
+        <w:t>ផ្នែក</w:t>
+      </w:r>
+      <w:r>
+        <w:t> </w:t>
+      </w:r>
+      <w:r>
+        <w:rPr>
+          <w:b/>
+          <w:bCs/>
+        </w:rPr>
+        <w:t>"</w:t>
+      </w:r>
+      <w:r>
+        <w:rPr>
+          <w:b/>
+          <w:bCs/>
+          <w:cs/>
+        </w:rPr>
+        <w:t>ម៉ោងបញ្ជូនរបាយការណ៍សិស្ស-គ្រូចាំថ្ងៃ តាមថ្ងៃនីមួយៗ (</w:t>
+      </w:r>
+      <w:r>
+        <w:rPr>
+          <w:b/>
+          <w:bCs/>
+        </w:rPr>
+        <w:t>Daily Dispatch Schedule)"</w:t>
+      </w:r>
+      <w:r>
+        <w:rPr>
+          <w:cs/>
+        </w:rPr>
+        <w:t>៖</w:t>
+      </w:r>
+    </w:p>
+    <w:p>
+      <w:pPr>
+        <w:numPr>
+          <w:ilvl w:val="1"/>
+          <w:numId w:val="3"/>
+        </w:numPr>
+        <w:jc w:val="both"/>
+      </w:pPr>
+      <w:r>
+        <w:rPr>
+          <w:cs/>
+        </w:rPr>
+        <w:t>កំណត់ម៉ោងតាមថ្ងៃ ឧទាហរណ៍៖</w:t>
+      </w:r>
+    </w:p>
+    <w:p>
+      <w:pPr>
+        <w:numPr>
+          <w:ilvl w:val="2"/>
+          <w:numId w:val="3"/>
+        </w:numPr>
+        <w:jc w:val="both"/>
+      </w:pPr>
+      <w:r>
+        <w:rPr>
+          <w:b/>
+          <w:bCs/>
+          <w:cs/>
+        </w:rPr>
+        <w:t>ថ្ងៃចន្ទ - សុក្រ</w:t>
+      </w:r>
+      <w:r>
+        <w:rPr>
+          <w:cs/>
+        </w:rPr>
+        <w:t>៖ ដាក់ម៉ោង</w:t>
+      </w:r>
+      <w:r>
+        <w:t> 17:15 (</w:t>
+      </w:r>
+      <w:r>
+        <w:rPr>
+          <w:cs/>
+        </w:rPr>
+        <w:t>ឬ</w:t>
+      </w:r>
+      <w:r>
+        <w:t> 17:00)</w:t>
+      </w:r>
+    </w:p>
+    <w:p>
+      <w:pPr>
+        <w:numPr>
+          <w:ilvl w:val="2"/>
+          <w:numId w:val="3"/>
+        </w:numPr>
+        <w:jc w:val="both"/>
+      </w:pPr>
+      <w:r>
+        <w:rPr>
+          <w:b/>
+          <w:bCs/>
+          <w:cs/>
+        </w:rPr>
+        <w:t>ថ្ងៃសៅរ៍</w:t>
+      </w:r>
+      <w:r>
+        <w:rPr>
+          <w:cs/>
+        </w:rPr>
+        <w:t>៖ ដាក់ម៉ោង</w:t>
+      </w:r>
+      <w:r>
+        <w:t> 11:30 (</w:t>
+      </w:r>
+      <w:r>
+        <w:rPr>
+          <w:cs/>
+        </w:rPr>
+        <w:t>ពេលចេញពីរៀនកន្លះថ្ងៃ)</w:t>
+      </w:r>
+    </w:p>
+    <w:p>
+      <w:pPr>
+        <w:numPr>
+          <w:ilvl w:val="2"/>
+          <w:numId w:val="3"/>
+        </w:numPr>
+        <w:jc w:val="both"/>
+      </w:pPr>
+      <w:r>
+        <w:rPr>
+          <w:b/>
+          <w:bCs/>
+          <w:cs/>
+        </w:rPr>
+        <w:t>ថ្ងៃអាទិត្យ</w:t>
+      </w:r>
+      <w:r>
+        <w:rPr>
+          <w:cs/>
+        </w:rPr>
+        <w:t>៖ ដាក់</w:t>
+      </w:r>
+      <w:r>
+        <w:t> off (</w:t>
+      </w:r>
+      <w:r>
+        <w:rPr>
+          <w:cs/>
+        </w:rPr>
+        <w:t>មិនឱ្យផ្ញើ)</w:t>
+      </w:r>
+    </w:p>
+    <w:p>
+      <w:pPr>
+        <w:numPr>
+          <w:ilvl w:val="0"/>
+          <w:numId w:val="3"/>
+        </w:numPr>
+        <w:jc w:val="both"/>
+      </w:pPr>
+      <w:r>
+        <w:rPr>
+          <w:cs/>
+        </w:rPr>
+        <w:t>ចុច</w:t>
+      </w:r>
+      <w:r>
+        <w:t> </w:t>
+      </w:r>
+      <w:r>
+        <w:rPr>
+          <w:b/>
+          <w:bCs/>
+          <w:cs/>
+        </w:rPr>
+        <w:t>រក្សាទុកម៉ោងបញ្ជូន</w:t>
+      </w:r>
+      <w:r>
+        <w:rPr>
+          <w:cs/>
+        </w:rPr>
+        <w:t>។</w:t>
+      </w:r>
+    </w:p>
+    <w:p>
+      <w:pPr>
+        <w:numPr>
+          <w:ilvl w:val="0"/>
+          <w:numId w:val="3"/>
+        </w:numPr>
+        <w:jc w:val="both"/>
+      </w:pPr>
+      <w:r>
+        <w:rPr>
+          <w:cs/>
+        </w:rPr>
+        <w:t xml:space="preserve">នៅពេលដល់ម៉ោងកំណត់ ប្រព័ន្ធនឹងចងក្រងទិន្នន័យវត្តមានប្រចាំថ្ងៃ និងផ្ញើរបាយការណ៍ទៅកាន់ </w:t>
+      </w:r>
+      <w:r>
+        <w:t xml:space="preserve">Telegram Chat ID </w:t>
+      </w:r>
+      <w:r>
+        <w:rPr>
+          <w:cs/>
+        </w:rPr>
+        <w:t>ដែលបានកំណត់ដោយស្វ័យប្រវត្តិ។</w:t>
+      </w:r>
+    </w:p>
+    <w:p>
+      <w:pPr>
+        <w:jc w:val="both"/>
+      </w:pPr>
+      <w:r>
+        <w:pict w14:anchorId="3A5F9B9E">
+          <v:rect id="_x0000_i1091" style="width:336.3pt;height:.75pt" o:hrpct="0" o:hralign="center" o:hrstd="t" o:hr="t" fillcolor="#a0a0a0" stroked="f"/>
+        </w:pict>
+      </w:r>
+    </w:p>
+    <w:p>
+      <w:pPr>
+        <w:jc w:val="both"/>
+      </w:pPr>
+      <w:r>
+        <w:rPr>
+          <w:cs/>
+        </w:rPr>
+        <w:t xml:space="preserve">៤. ការផ្ញើរបាយការណ៍តាមម៉ោងទៅ </w:t>
+      </w:r>
+      <w:r>
+        <w:t xml:space="preserve">Group </w:t>
+      </w:r>
+      <w:r>
+        <w:rPr>
+          <w:cs/>
+        </w:rPr>
+        <w:t>ថ្នាក់ និងអាណាព្យាបាល</w:t>
+      </w:r>
+    </w:p>
+    <w:p>
+      <w:pPr>
+        <w:jc w:val="both"/>
+      </w:pPr>
+      <w:r>
+        <w:rPr>
+          <w:cs/>
+        </w:rPr>
+        <w:t>ក្រៅពីរបាយការណ៍ប្រចាំថ្ងៃ ប្រព័ន្ធក៏អាចផ្ញើរបាយការណ៍អវត្តមានតាមម៉ោងនីមួយៗបានផងដែរ៖</w:t>
+      </w:r>
+    </w:p>
+    <w:p>
+      <w:pPr>
+        <w:numPr>
+          <w:ilvl w:val="0"/>
+          <w:numId w:val="4"/>
+        </w:numPr>
+        <w:jc w:val="both"/>
+      </w:pPr>
+      <w:r>
+        <w:rPr>
+          <w:b/>
+          <w:bCs/>
+        </w:rPr>
+        <w:t xml:space="preserve">Telegram Group </w:t>
+      </w:r>
+      <w:r>
+        <w:rPr>
+          <w:b/>
+          <w:bCs/>
+          <w:cs/>
+        </w:rPr>
+        <w:t>របស់ថ្នាក់រៀន</w:t>
+      </w:r>
+      <w:r>
+        <w:rPr>
+          <w:cs/>
+        </w:rPr>
+        <w:t>៖</w:t>
+      </w:r>
+    </w:p>
+    <w:p>
+      <w:pPr>
+        <w:numPr>
+          <w:ilvl w:val="1"/>
+          <w:numId w:val="4"/>
+        </w:numPr>
+        <w:jc w:val="both"/>
+      </w:pPr>
+      <w:r>
+        <w:rPr>
+          <w:cs/>
+        </w:rPr>
+        <w:lastRenderedPageBreak/>
+        <w:t>ចូលទៅកាន់ទំព័រ</w:t>
+      </w:r>
+      <w:r>
+        <w:t> </w:t>
+      </w:r>
+      <w:r>
+        <w:rPr>
+          <w:b/>
+          <w:bCs/>
+          <w:cs/>
+        </w:rPr>
+        <w:t>កាលវិភាគ (</w:t>
+      </w:r>
+      <w:r>
+        <w:rPr>
+          <w:b/>
+          <w:bCs/>
+        </w:rPr>
+        <w:t>Timetable)</w:t>
+      </w:r>
+      <w:r>
+        <w:t> </w:t>
+      </w:r>
+    </w:p>
+    <w:p>
+      <w:pPr>
+        <w:jc w:val="both"/>
+      </w:pPr>
+      <w:r>
+        <mc:AlternateContent>
+          <mc:Choice Requires="wps">
+            <w:drawing>
+              <wp:inline distT="0" distB="0" distL="0" distR="0" wp14:anchorId="00E1C036" wp14:editId="61ADFEE6">
+                <wp:extent cx="304800" cy="304800"/>
+                <wp:effectExtent l="0" t="0" r="0" b="0"/>
+                <wp:docPr id="779508233" name="Rectangle 9"/>
+                <wp:cNvGraphicFramePr>
+                  <a:graphicFrameLocks xmlns:a="http://schemas.openxmlformats.org/drawingml/2006/main" noChangeAspect="1"/>
+                </wp:cNvGraphicFramePr>
+                <a:graphic xmlns:a="http://schemas.openxmlformats.org/drawingml/2006/main">
+                  <a:graphicData uri="http://schemas.microsoft.com/office/word/2010/wordprocessingShape">
+                    <wps:wsp>
+                      <wps:cNvSpPr>
+                        <a:spLocks noChangeAspect="1" noChangeArrowheads="1"/>
+                      </wps:cNvSpPr>
+                      <wps:spPr bwMode="auto">
+                        <a:xfrm>
+                          <a:off x="0" y="0"/>
+                          <a:ext cx="304800" cy="304800"/>
+                        </a:xfrm>
+                        <a:prstGeom prst="rect">
+                          <a:avLst/>
+                        </a:prstGeom>
+                        <a:noFill/>
+                        <a:ln>
+                          <a:noFill/>
+                        </a:ln>
+                        <a:extLst>
+                          <a:ext uri="{909E8E84-426E-40DD-AFC4-6F175D3DCCD1}">
+                            <a14:hiddenFill xmlns:a14="http://schemas.microsoft.com/office/drawing/2010/main">
+                              <a:solidFill>
+                                <a:srgbClr val="FFFFFF"/>
+                              </a:solidFill>
+                            </a14:hiddenFill>
+                          </a:ext>
+                          <a:ext uri="{91240B29-F687-4F45-9708-019B960494DF}">
+                            <a14:hiddenLine xmlns:a14="http://schemas.microsoft.com/office/drawing/2010/main" w="9525">
+                              <a:solidFill>
+                                <a:srgbClr val="000000"/>
+                              </a:solidFill>
+                              <a:miter lim="800000"/>
+                              <a:headEnd/>
+                              <a:tailEnd/>
+                            </a14:hiddenLine>
+                          </a:ext>
+                        </a:extLst>
+                      </wps:spPr>
+                      <wps:bodyPr rot="0" vert="horz" wrap="square" lIns="91440" tIns="45720" rIns="91440" bIns="45720" anchor="t" anchorCtr="0" upright="1">
+                        <a:noAutofit/>
+                      </wps:bodyPr>
+                    </wps:wsp>
+                  </a:graphicData>
+                </a:graphic>
+              </wp:inline>
+            </w:drawing>
+          </mc:Choice>
+          <mc:Fallback>
+            <w:pict>
+              <v:rect w14:anchorId="2582DF22" id="Rectangle 9" o:spid="_x0000_s1026" style="width:24pt;height:24pt;visibility:visible;mso-wrap-style:square;mso-left-percent:-10001;mso-top-percent:-10001;mso-position-horizontal:absolute;mso-position-horizontal-relative:char;mso-position-vertical:absolute;mso-position-vertical-relative:line;mso-left-percent:-10001;mso-top-percent:-10001;v-text-anchor:top" o:gfxdata="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" filled="f" stroked="f">
+                <o:lock v:ext="edit" aspectratio="t"/>
+                <w10:anchorlock/>
+              </v:rect>
+            </w:pict>
+          </mc:Fallback>
+        </mc:AlternateContent>
+      </w:r>
+    </w:p>
+    <w:p>
+      <w:pPr>
+        <w:jc w:val="both"/>
+      </w:pPr>
+      <w:r>
+        <w:t>timetable.html</w:t>
+      </w:r>
+    </w:p>
+    <w:p>
+      <w:pPr>
+        <w:numPr>
+          <w:ilvl w:val="1"/>
+          <w:numId w:val="4"/>
+        </w:numPr>
+        <w:jc w:val="both"/>
+      </w:pPr>
+      <w:r>
+        <w:rPr>
+          <w:cs/>
+        </w:rPr>
+        <w:t>ជ្រើសរើសថ្នាក់រៀន រួចចុចលើប៊ូតុង</w:t>
+      </w:r>
+      <w:r>
+        <w:t> </w:t>
+      </w:r>
+      <w:r>
+        <w:rPr>
+          <w:b/>
+          <w:bCs/>
+        </w:rPr>
+        <w:t>"</w:t>
+      </w:r>
+      <w:r>
+        <w:rPr>
+          <w:b/>
+          <w:bCs/>
+          <w:cs/>
+        </w:rPr>
+        <w:t>កែប្រែគ្រូបន្ទុក</w:t>
+      </w:r>
+      <w:r>
+        <w:rPr>
+          <w:b/>
+          <w:bCs/>
+        </w:rPr>
+        <w:t xml:space="preserve"> &amp; Telegram"</w:t>
+      </w:r>
+    </w:p>
+    <w:p>
+      <w:pPr>
+        <w:numPr>
+          <w:ilvl w:val="1"/>
+          <w:numId w:val="4"/>
+        </w:numPr>
+        <w:jc w:val="both"/>
+      </w:pPr>
+      <w:r>
+        <w:rPr>
+          <w:cs/>
+        </w:rPr>
+        <w:t>បញ្ចូល</w:t>
+      </w:r>
+      <w:r>
+        <w:t> </w:t>
+      </w:r>
+      <w:r>
+        <w:rPr>
+          <w:b/>
+          <w:bCs/>
+        </w:rPr>
+        <w:t xml:space="preserve">Telegram Group Chat ID </w:t>
+      </w:r>
+      <w:r>
+        <w:rPr>
+          <w:b/>
+          <w:bCs/>
+          <w:cs/>
+        </w:rPr>
+        <w:t>ថ្នាក់រៀន</w:t>
+      </w:r>
+    </w:p>
+    <w:p>
+      <w:pPr>
+        <w:numPr>
+          <w:ilvl w:val="1"/>
+          <w:numId w:val="4"/>
+        </w:numPr>
+        <w:jc w:val="both"/>
+      </w:pPr>
+      <w:r>
+        <w:rPr>
+          <w:cs/>
+        </w:rPr>
+        <w:t xml:space="preserve">រាល់ពេលគ្រូបង្រៀនស្រង់វត្តមានចប់ក្នុងម៉ោងសិក្សា ប្រព័ន្ធនឹងផ្ញើសេចក្តីសង្ខេបបញ្ជីសិស្សអវត្តមានចូលទៅក្នុង </w:t>
+      </w:r>
+      <w:r>
+        <w:t xml:space="preserve">Group </w:t>
+      </w:r>
+      <w:r>
+        <w:rPr>
+          <w:cs/>
+        </w:rPr>
+        <w:t>ថ្នាក់នោះភ្លាមៗ។</w:t>
+      </w:r>
+    </w:p>
+    <w:p>
+      <w:pPr>
+        <w:numPr>
+          <w:ilvl w:val="0"/>
+          <w:numId w:val="4"/>
+        </w:numPr>
+        <w:jc w:val="both"/>
+      </w:pPr>
+      <w:r>
+        <w:rPr>
+          <w:b/>
+          <w:bCs/>
+        </w:rPr>
+        <w:t xml:space="preserve">Telegram </w:t>
+      </w:r>
+      <w:r>
+        <w:rPr>
+          <w:b/>
+          <w:bCs/>
+          <w:cs/>
+        </w:rPr>
+        <w:t>របស់អាណាព្យាបាលសិស្ស</w:t>
+      </w:r>
+      <w:r>
+        <w:rPr>
+          <w:cs/>
+        </w:rPr>
+        <w:t>៖</w:t>
+      </w:r>
+    </w:p>
+    <w:p>
+      <w:pPr>
+        <w:numPr>
+          <w:ilvl w:val="1"/>
+          <w:numId w:val="4"/>
+        </w:numPr>
+        <w:jc w:val="both"/>
+      </w:pPr>
+      <w:r>
+        <w:rPr>
+          <w:cs/>
+        </w:rPr>
+        <w:t>ចូលទៅកាន់ទំព័រ</w:t>
+      </w:r>
+      <w:r>
+        <w:t> </w:t>
+      </w:r>
+      <w:r>
+        <w:rPr>
+          <w:b/>
+          <w:bCs/>
+          <w:cs/>
+        </w:rPr>
+        <w:t>គ្រប់គ្រងសិស្ស (</w:t>
+      </w:r>
+      <w:r>
+        <w:rPr>
+          <w:b/>
+          <w:bCs/>
+        </w:rPr>
+        <w:t>Students)</w:t>
+      </w:r>
+      <w:r>
+        <w:t> </w:t>
+      </w:r>
+    </w:p>
+    <w:p>
+      <w:pPr>
+        <w:jc w:val="both"/>
+      </w:pPr>
+      <w:r>
+        <mc:AlternateContent>
+          <mc:Choice Requires="wps">
+            <w:drawing>
+              <wp:inline distT="0" distB="0" distL="0" distR="0" wp14:anchorId="6F9799DA" wp14:editId="20647406">
+                <wp:extent cx="304800" cy="304800"/>
+                <wp:effectExtent l="0" t="0" r="0" b="0"/>
+                <wp:docPr id="1141181918" name="Rectangle 8"/>
+                <wp:cNvGraphicFramePr>
+                  <a:graphicFrameLocks xmlns:a="http://schemas.openxmlformats.org/drawingml/2006/main" noChangeAspect="1"/>
+                </wp:cNvGraphicFramePr>
+                <a:graphic xmlns:a="http://schemas.openxmlformats.org/drawingml/2006/main">
+                  <a:graphicData uri="http://schemas.microsoft.com/office/word/2010/wordprocessingShape">
+                    <wps:wsp>
+                      <wps:cNvSpPr>
+                        <a:spLocks noChangeAspect="1" noChangeArrowheads="1"/>
+                      </wps:cNvSpPr>
+                      <wps:spPr bwMode="auto">
+                        <a:xfrm>
+                          <a:off x="0" y="0"/>
+                          <a:ext cx="304800" cy="304800"/>
+                        </a:xfrm>
+                        <a:prstGeom prst="rect">
+                          <a:avLst/>
+                        </a:prstGeom>
+                        <a:noFill/>
+                        <a:ln>
+                          <a:noFill/>
+                        </a:ln>
+                        <a:extLst>
+                          <a:ext uri="{909E8E84-426E-40DD-AFC4-6F175D3DCCD1}">
+                            <a14:hiddenFill xmlns:a14="http://schemas.microsoft.com/office/drawing/2010/main">
+                              <a:solidFill>
+                                <a:srgbClr val="FFFFFF"/>
+                              </a:solidFill>
+                            </a14:hiddenFill>
+                          </a:ext>
+                          <a:ext uri="{91240B29-F687-4F45-9708-019B960494DF}">
+                            <a14:hiddenLine xmlns:a14="http://schemas.microsoft.com/office/drawing/2010/main" w="9525">
+                              <a:solidFill>
+                                <a:srgbClr val="000000"/>
+                              </a:solidFill>
+                              <a:miter lim="800000"/>
+                              <a:headEnd/>
+                              <a:tailEnd/>
+                            </a14:hiddenLine>
+                          </a:ext>
+                        </a:extLst>
+                      </wps:spPr>
+                      <wps:bodyPr rot="0" vert="horz" wrap="square" lIns="91440" tIns="45720" rIns="91440" bIns="45720" anchor="t" anchorCtr="0" upright="1">
+                        <a:noAutofit/>
+                      </wps:bodyPr>
+                    </wps:wsp>
+                  </a:graphicData>
+                </a:graphic>
+              </wp:inline>
+            </w:drawing>
+          </mc:Choice>
+          <mc:Fallback>
+            <w:pict>
+              <v:rect w14:anchorId="5E7F45ED" id="Rectangle 8" o:spid="_x0000_s1026" style="width:24pt;height:24pt;visibility:visible;mso-wrap-style:square;mso-left-percent:-10001;mso-top-percent:-10001;mso-position-horizontal:absolute;mso-position-horizontal-relative:char;mso-position-vertical:absolute;mso-position-vertical-relative:line;mso-left-percent:-10001;mso-top-percent:-10001;v-text-anchor:top" o:gfxdata="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" filled="f" stroked="f">
+                <o:lock v:ext="edit" aspectratio="t"/>
+                <w10:anchorlock/>
+              </v:rect>
+            </w:pict>
+          </mc:Fallback>
+        </mc:AlternateContent>
+      </w:r>
+    </w:p>
+    <w:p>
+      <w:pPr>
+        <w:jc w:val="both"/>
+      </w:pPr>
+      <w:r>
+        <w:t>students.html</w:t>
+      </w:r>
+    </w:p>
+    <w:p>
+      <w:pPr>
+        <w:numPr>
+          <w:ilvl w:val="1"/>
+          <w:numId w:val="4"/>
+        </w:numPr>
+        <w:jc w:val="both"/>
+      </w:pPr>
+      <w:r>
+        <w:rPr>
+          <w:cs/>
+        </w:rPr>
+        <w:t>កែប្រែព័ត៌មានសិស្ស ហើយបំពេញប្រឡោះ</w:t>
+      </w:r>
+      <w:r>
+        <w:t> </w:t>
+      </w:r>
+      <w:r>
+        <w:rPr>
+          <w:b/>
+          <w:bCs/>
+        </w:rPr>
+        <w:t xml:space="preserve">Telegram </w:t>
+      </w:r>
+      <w:r>
+        <w:rPr>
+          <w:b/>
+          <w:bCs/>
+          <w:cs/>
+        </w:rPr>
+        <w:t>អាណាព្យាបាល</w:t>
+      </w:r>
+      <w:r>
+        <w:t xml:space="preserve"> (Chat ID </w:t>
+      </w:r>
+      <w:r>
+        <w:rPr>
+          <w:cs/>
+        </w:rPr>
+        <w:t>ឬ</w:t>
+      </w:r>
+      <w:r>
+        <w:t> @username)</w:t>
+      </w:r>
+    </w:p>
+    <w:p>
+      <w:pPr>
+        <w:numPr>
+          <w:ilvl w:val="1"/>
+          <w:numId w:val="4"/>
+        </w:numPr>
+        <w:jc w:val="both"/>
+      </w:pPr>
+      <w:r>
+        <w:rPr>
+          <w:cs/>
+        </w:rPr>
+        <w:t>ប្រសិនបើសិស្សត្រូវបានកត់ត្រាថា "អវត្តមាន" ឬ "សុំច្បាប់" ប្រព័ន្ធនឹងផ្ញើសារជូនដំណឹងដោយស្វ័យប្រវត្តិទៅកាន់អាណាព្យាបាលផ្ទាល់។</w:t>
+      </w:r>
+    </w:p>
+    <w:p>
+      <w:pPr>
+        <w:jc w:val="both"/>
+      </w:pPr>
+      <w:r>
+        <w:pict w14:anchorId="25F62FEB">
+          <v:rect id="_x0000_i1094" style="width:336.3pt;height:.75pt" o:hrpct="0" o:hralign="center" o:hrstd="t" o:hr="t" fillcolor="#a0a0a0" stroked="f"/>
+        </w:pict>
+      </w:r>
+    </w:p>
+    <w:p>
+      <w:pPr>
+        <w:jc w:val="both"/>
+      </w:pPr>
+      <w:r>
+        <w:rPr>
+          <w:cs/>
+        </w:rPr>
+        <w:t xml:space="preserve">៥. ទម្រង់គំរូនៃរបាយការណ៍ដែលបង្ហាញលើ </w:t>
+      </w:r>
+      <w:r>
+        <w:t>Telegram</w:t>
+      </w:r>
+    </w:p>
+    <w:p>
+      <w:pPr>
+        <w:jc w:val="both"/>
+      </w:pPr>
+      <w:r>
+        <w:rPr>
+          <w:cs/>
+        </w:rPr>
+        <w:t>របាយការណ៍ដែលផ្ញើចេញពី</w:t>
+      </w:r>
+      <w:r>
+        <w:t> </w:t>
+      </w:r>
+    </w:p>
+    <w:p>
+      <w:pPr>
+        <w:jc w:val="both"/>
+      </w:pPr>
+      <w:r>
+        <mc:AlternateContent>
+          <mc:Choice Requires="wps">
+            <w:drawing>
+              <wp:inline distT="0" distB="0" distL="0" distR="0" wp14:anchorId="709902CA" wp14:editId="21923DDF">
+                <wp:extent cx="304800" cy="304800"/>
+                <wp:effectExtent l="0" t="0" r="0" b="0"/>
+                <wp:docPr id="1750258647" name="Rectangle 7"/>
+                <wp:cNvGraphicFramePr>
+                  <a:graphicFrameLocks xmlns:a="http://schemas.openxmlformats.org/drawingml/2006/main" noChangeAspect="1"/>
+                </wp:cNvGraphicFramePr>
+                <a:graphic xmlns:a="http://schemas.openxmlformats.org/drawingml/2006/main">
+                  <a:graphicData uri="http://schemas.microsoft.com/office/word/2010/wordprocessingShape">
+                    <wps:wsp>
+                      <wps:cNvSpPr>
+                        <a:spLocks noChangeAspect="1" noChangeArrowheads="1"/>
+                      </wps:cNvSpPr>
+                      <wps:spPr bwMode="auto">
+                        <a:xfrm>
+                          <a:off x="0" y="0"/>
+                          <a:ext cx="304800" cy="304800"/>
+                        </a:xfrm>
+                        <a:prstGeom prst="rect">
+                          <a:avLst/>
+                        </a:prstGeom>
+                        <a:noFill/>
+                        <a:ln>
+                          <a:noFill/>
+                        </a:ln>
+                        <a:extLst>
+                          <a:ext uri="{909E8E84-426E-40DD-AFC4-6F175D3DCCD1}">
+                            <a14:hiddenFill xmlns:a14="http://schemas.microsoft.com/office/drawing/2010/main">
+                              <a:solidFill>
+                                <a:srgbClr val="FFFFFF"/>
+                              </a:solidFill>
+                            </a14:hiddenFill>
+                          </a:ext>
+                          <a:ext uri="{91240B29-F687-4F45-9708-019B960494DF}">
+                            <a14:hiddenLine xmlns:a14="http://schemas.microsoft.com/office/drawing/2010/main" w="9525">
+                              <a:solidFill>
+                                <a:srgbClr val="000000"/>
+                              </a:solidFill>
+                              <a:miter lim="800000"/>
+                              <a:headEnd/>
+                              <a:tailEnd/>
+                            </a14:hiddenLine>
+                          </a:ext>
+                        </a:extLst>
+                      </wps:spPr>
+                      <wps:bodyPr rot="0" vert="horz" wrap="square" lIns="91440" tIns="45720" rIns="91440" bIns="45720" anchor="t" anchorCtr="0" upright="1">
+                        <a:noAutofit/>
+                      </wps:bodyPr>
+                    </wps:wsp>
+                  </a:graphicData>
+                </a:graphic>
+              </wp:inline>
+            </w:drawing>
+          </mc:Choice>
+          <mc:Fallback>
+            <w:pict>
+              <v:rect w14:anchorId="23F9FC73" id="Rectangle 7" o:spid="_x0000_s1026" style="width:24pt;height:24pt;visibility:visible;mso-wrap-style:square;mso-left-percent:-10001;mso-top-percent:-10001;mso-position-horizontal:absolute;mso-position-horizontal-relative:char;mso-position-vertical:absolute;mso-position-vertical-relative:line;mso-left-percent:-10001;mso-top-percent:-10001;v-text-anchor:top" o:gfxdata="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" filled="f" stroked="f">
+                <o:lock v:ext="edit" aspectratio="t"/>
+                <w10:anchorlock/>
+              </v:rect>
+            </w:pict>
+          </mc:Fallback>
+        </mc:AlternateContent>
+      </w:r>
+    </w:p>
+    <w:p>
+      <w:pPr>
+        <w:jc w:val="both"/>
+      </w:pPr>
+      <w:r>
+        <w:t>telegram_service.py </w:t>
+      </w:r>
+      <w:r>
+        <w:rPr>
+          <w:cs/>
+        </w:rPr>
+        <w:t>ត្រូវបានរៀបចំជាទម្រង់ខ្មែរយ៉ាងស្អាត៖</w:t>
+      </w:r>
+    </w:p>
+    <w:p>
+      <w:pPr>
+        <w:jc w:val="both"/>
+      </w:pPr>
+      <w:r>
+        <w:rPr>
+          <w:b/>
+          <w:bCs/>
+          <w:cs/>
+        </w:rPr>
+        <w:t>គំរូរបាយការណ៍សិស្ស៖</w:t>
+      </w:r>
+    </w:p>
+    <w:p>
+      <w:pPr>
+        <w:jc w:val="both"/>
+      </w:pPr>
+      <w:r>
+        <w:lastRenderedPageBreak/>
+        <w:t>text</w:t>
+      </w:r>
+    </w:p>
+    <w:p>
+      <w:pPr>
+        <w:jc w:val="both"/>
+      </w:pPr>
+      <w:r>
+        <w:rPr>
+          <w:rFonts w:ascii="Segoe UI Emoji" w:hAnsi="Segoe UI Emoji" w:cs="Segoe UI Emoji"/>
+        </w:rPr>
+        <w:t>📊</w:t>
+      </w:r>
+      <w:r>
+        <w:t xml:space="preserve"> </w:t>
+      </w:r>
+      <w:r>
+        <w:rPr>
+          <w:cs/>
+        </w:rPr>
+        <w:t>របាយការណ៍អវត្តមានសិស្សប្រចាំថ្ងៃ (</w:t>
+      </w:r>
+      <w:r>
+        <w:t>Daily Student Absence Report)</w:t>
+      </w:r>
+    </w:p>
+    <w:p>
+      <w:pPr>
+        <w:jc w:val="both"/>
+      </w:pPr>
+      <w:r>
+        <w:rPr>
+          <w:rFonts w:ascii="Segoe UI Emoji" w:hAnsi="Segoe UI Emoji" w:cs="Segoe UI Emoji"/>
+        </w:rPr>
+        <w:t>🏫</w:t>
+      </w:r>
+      <w:r>
+        <w:t xml:space="preserve"> </w:t>
+      </w:r>
+      <w:r>
+        <w:rPr>
+          <w:cs/>
+        </w:rPr>
+        <w:t>វិទ្យាល័យ ហ៊ុន សែន កំពង់កន្ទួត</w:t>
+      </w:r>
+    </w:p>
+    <w:p>
+      <w:pPr>
+        <w:jc w:val="both"/>
+      </w:pPr>
+      <w:r>
+        <w:rPr>
+          <w:rFonts w:ascii="Segoe UI Emoji" w:hAnsi="Segoe UI Emoji" w:cs="Segoe UI Emoji"/>
+        </w:rPr>
+        <w:t>📅</w:t>
+      </w:r>
+      <w:r>
+        <w:t xml:space="preserve"> </w:t>
+      </w:r>
+      <w:r>
+        <w:rPr>
+          <w:cs/>
+        </w:rPr>
+        <w:t>កាលបរិច្ឆេទ៖ ២៣/០៩/២០២៦</w:t>
+      </w:r>
+    </w:p>
+    <w:p>
+      <w:pPr>
+        <w:jc w:val="both"/>
+      </w:pPr>
+      <w:r>
+        <w:rPr>
+          <w:rFonts w:ascii="MS Mincho" w:eastAsia="MS Mincho" w:hAnsi="MS Mincho" w:cs="MS Mincho" w:hint="eastAsia"/>
+        </w:rPr>
+        <w:t>━━━━━━━━━━━━━━━━━━━━</w:t>
+      </w:r>
+    </w:p>
+    <w:p>
+      <w:pPr>
+        <w:jc w:val="both"/>
+      </w:pPr>
+      <w:r>
+        <w:rPr>
+          <w:rFonts w:ascii="Segoe UI Emoji" w:hAnsi="Segoe UI Emoji" w:cs="Segoe UI Emoji"/>
+        </w:rPr>
+        <w:t>👥</w:t>
+      </w:r>
+      <w:r>
+        <w:t xml:space="preserve"> </w:t>
+      </w:r>
+      <w:r>
+        <w:rPr>
+          <w:cs/>
+        </w:rPr>
+        <w:t>អវត្តមានសិស្សានុសិស្សសរុប៖ ៥ នាក់</w:t>
+      </w:r>
+    </w:p>
+    <w:p>
+      <w:pPr>
+        <w:jc w:val="both"/>
+      </w:pPr>
+      <w:r>
+        <w:t xml:space="preserve">   </w:t>
+      </w:r>
+      <w:r>
+        <w:rPr>
+          <w:rFonts w:ascii="Segoe UI Emoji" w:hAnsi="Segoe UI Emoji" w:cs="Segoe UI Emoji"/>
+        </w:rPr>
+        <w:t>❌</w:t>
+      </w:r>
+      <w:r>
+        <w:t xml:space="preserve"> </w:t>
+      </w:r>
+      <w:r>
+        <w:rPr>
+          <w:cs/>
+        </w:rPr>
+        <w:t>ឥតច្បាប់ (</w:t>
+      </w:r>
+      <w:r>
+        <w:t>ABSENT)</w:t>
+      </w:r>
+      <w:r>
+        <w:rPr>
+          <w:cs/>
+        </w:rPr>
+        <w:t>៖ ៣ នាក់</w:t>
+      </w:r>
+    </w:p>
+    <w:p>
+      <w:pPr>
+        <w:jc w:val="both"/>
+      </w:pPr>
+      <w:r>
+        <w:t xml:space="preserve">   </w:t>
+      </w:r>
+      <w:r>
+        <w:rPr>
+          <w:rFonts w:ascii="Segoe UI Emoji" w:hAnsi="Segoe UI Emoji" w:cs="Segoe UI Emoji"/>
+        </w:rPr>
+        <w:t>⚠️</w:t>
+      </w:r>
+      <w:r>
+        <w:t xml:space="preserve"> </w:t>
+      </w:r>
+      <w:r>
+        <w:rPr>
+          <w:cs/>
+        </w:rPr>
+        <w:t>មានច្បាប់ (</w:t>
+      </w:r>
+      <w:r>
+        <w:t>PERMISSION)</w:t>
+      </w:r>
+      <w:r>
+        <w:rPr>
+          <w:cs/>
+        </w:rPr>
+        <w:t>៖ ២ នាក់</w:t>
+      </w:r>
+    </w:p>
+    <w:p>
+      <w:pPr>
+        <w:jc w:val="both"/>
+      </w:pPr>
+      <w:r>
+        <w:rPr>
+          <w:rFonts w:ascii="Segoe UI Emoji" w:hAnsi="Segoe UI Emoji" w:cs="Segoe UI Emoji"/>
+        </w:rPr>
+        <w:t>📋</w:t>
+      </w:r>
+      <w:r>
+        <w:t xml:space="preserve"> </w:t>
+      </w:r>
+      <w:r>
+        <w:rPr>
+          <w:cs/>
+        </w:rPr>
+        <w:t>ព័ត៌មានលម្អិតតាមថ្នាក់រៀន៖</w:t>
+      </w:r>
+    </w:p>
+    <w:p>
+      <w:pPr>
+        <w:jc w:val="both"/>
+      </w:pPr>
+      <w:r>
+        <w:t xml:space="preserve">• </w:t>
+      </w:r>
+      <w:r>
+        <w:rPr>
+          <w:cs/>
+        </w:rPr>
+        <w:t xml:space="preserve">ថ្នាក់ </w:t>
+      </w:r>
+      <w:r>
+        <w:t>12A (</w:t>
+      </w:r>
+      <w:r>
+        <w:rPr>
+          <w:cs/>
+        </w:rPr>
+        <w:t xml:space="preserve">៣ </w:t>
+      </w:r>
+      <w:proofErr w:type="gramStart"/>
+      <w:r>
+        <w:rPr>
+          <w:cs/>
+        </w:rPr>
+        <w:t>នាក់)៖</w:t>
+      </w:r>
+      <w:proofErr w:type="gramEnd"/>
+      <w:r>
+        <w:rPr>
+          <w:cs/>
+        </w:rPr>
+        <w:t xml:space="preserve"> </w:t>
+      </w:r>
+      <w:r>
+        <w:rPr>
+          <w:rFonts w:ascii="Segoe UI Emoji" w:hAnsi="Segoe UI Emoji" w:cs="Segoe UI Emoji" w:hint="cs"/>
+          <w:cs/>
+        </w:rPr>
+        <w:t>❌</w:t>
+      </w:r>
+      <w:r>
+        <w:rPr>
+          <w:cs/>
+        </w:rPr>
+        <w:t xml:space="preserve"> </w:t>
+      </w:r>
+      <w:r>
+        <w:rPr>
+          <w:rFonts w:hint="cs"/>
+          <w:cs/>
+        </w:rPr>
+        <w:t>សុខ</w:t>
+      </w:r>
+      <w:r>
+        <w:rPr>
+          <w:cs/>
+        </w:rPr>
+        <w:t xml:space="preserve"> </w:t>
+      </w:r>
+      <w:r>
+        <w:rPr>
+          <w:rFonts w:hint="cs"/>
+          <w:cs/>
+        </w:rPr>
+        <w:t>ចាន់</w:t>
+      </w:r>
+      <w:r>
+        <w:t xml:space="preserve">, </w:t>
+      </w:r>
+      <w:r>
+        <w:rPr>
+          <w:rFonts w:ascii="Segoe UI Emoji" w:hAnsi="Segoe UI Emoji" w:cs="Segoe UI Emoji"/>
+        </w:rPr>
+        <w:t>❌</w:t>
+      </w:r>
+      <w:r>
+        <w:t xml:space="preserve"> </w:t>
+      </w:r>
+      <w:r>
+        <w:rPr>
+          <w:cs/>
+        </w:rPr>
+        <w:t>កែវ វិបុល</w:t>
+      </w:r>
+      <w:r>
+        <w:t xml:space="preserve">, </w:t>
+      </w:r>
+      <w:r>
+        <w:rPr>
+          <w:rFonts w:ascii="Segoe UI Emoji" w:hAnsi="Segoe UI Emoji" w:cs="Segoe UI Emoji"/>
+        </w:rPr>
+        <w:t>⚠️</w:t>
+      </w:r>
+      <w:r>
+        <w:t xml:space="preserve"> </w:t>
+      </w:r>
+      <w:r>
+        <w:rPr>
+          <w:cs/>
+        </w:rPr>
+        <w:t>ម៉េង ស្រីពៅ</w:t>
+      </w:r>
+    </w:p>
+    <w:p>
+      <w:pPr>
+        <w:jc w:val="both"/>
+      </w:pPr>
+      <w:r>
+        <w:t xml:space="preserve">• </w:t>
+      </w:r>
+      <w:r>
+        <w:rPr>
+          <w:cs/>
+        </w:rPr>
+        <w:t xml:space="preserve">ថ្នាក់ </w:t>
+      </w:r>
+      <w:r>
+        <w:t>11B (</w:t>
+      </w:r>
+      <w:r>
+        <w:rPr>
+          <w:cs/>
+        </w:rPr>
+        <w:t xml:space="preserve">២ </w:t>
+      </w:r>
+      <w:proofErr w:type="gramStart"/>
+      <w:r>
+        <w:rPr>
+          <w:cs/>
+        </w:rPr>
+        <w:t>នាក់)៖</w:t>
+      </w:r>
+      <w:proofErr w:type="gramEnd"/>
+      <w:r>
+        <w:rPr>
+          <w:cs/>
+        </w:rPr>
+        <w:t xml:space="preserve"> </w:t>
+      </w:r>
+      <w:r>
+        <w:rPr>
+          <w:rFonts w:ascii="Segoe UI Emoji" w:hAnsi="Segoe UI Emoji" w:cs="Segoe UI Emoji" w:hint="cs"/>
+          <w:cs/>
+        </w:rPr>
+        <w:t>❌</w:t>
+      </w:r>
+      <w:r>
+        <w:rPr>
+          <w:cs/>
+        </w:rPr>
+        <w:t xml:space="preserve"> </w:t>
+      </w:r>
+      <w:r>
+        <w:rPr>
+          <w:rFonts w:hint="cs"/>
+          <w:cs/>
+        </w:rPr>
+        <w:t>ឡុង</w:t>
+      </w:r>
+      <w:r>
+        <w:rPr>
+          <w:cs/>
+        </w:rPr>
+        <w:t xml:space="preserve"> </w:t>
+      </w:r>
+      <w:r>
+        <w:rPr>
+          <w:rFonts w:hint="cs"/>
+          <w:cs/>
+        </w:rPr>
+        <w:t>រតនា</w:t>
+      </w:r>
+      <w:r>
+        <w:t xml:space="preserve">, </w:t>
+      </w:r>
+      <w:r>
+        <w:rPr>
+          <w:rFonts w:ascii="Segoe UI Emoji" w:hAnsi="Segoe UI Emoji" w:cs="Segoe UI Emoji"/>
+        </w:rPr>
+        <w:t>⚠️</w:t>
+      </w:r>
+      <w:r>
+        <w:t xml:space="preserve"> </w:t>
+      </w:r>
+      <w:r>
+        <w:rPr>
+          <w:cs/>
+        </w:rPr>
+        <w:t>ជា ធីតា</w:t>
+      </w:r>
+    </w:p>
+    <w:p>
+      <w:pPr>
+        <w:jc w:val="both"/>
+      </w:pPr>
+      <w:r>
+        <w:rPr>
+          <w:rFonts w:ascii="Segoe UI Emoji" w:hAnsi="Segoe UI Emoji" w:cs="Segoe UI Emoji"/>
+        </w:rPr>
+        <w:t>🕒</w:t>
+      </w:r>
+      <w:r>
+        <w:t xml:space="preserve"> </w:t>
+      </w:r>
+      <w:r>
+        <w:rPr>
+          <w:cs/>
+        </w:rPr>
+        <w:t>បញ្ជូនរបាយការណ៍នៅម៉ោង៖ ១៧:១៥</w:t>
+      </w:r>
+    </w:p>
+    <w:p>
+      <w:pPr>
+        <w:jc w:val="both"/>
+      </w:pPr>
+      <w:r>
+        <w:rPr>
+          <w:b/>
+          <w:bCs/>
+          <w:cs/>
+        </w:rPr>
+        <w:t>គំរូរបាយការណ៍គ្រូបង្រៀន៖</w:t>
+      </w:r>
+    </w:p>
+    <w:p>
+      <w:pPr>
+        <w:jc w:val="both"/>
+      </w:pPr>
+      <w:r>
+        <w:t>text</w:t>
+      </w:r>
+    </w:p>
+    <w:p>
+      <w:pPr>
+        <w:jc w:val="both"/>
+      </w:pPr>
+      <w:r>
+        <w:rPr>
+          <w:rFonts w:ascii="Segoe UI Emoji" w:hAnsi="Segoe UI Emoji" w:cs="Segoe UI Emoji"/>
+        </w:rPr>
+        <w:t>👨</w:t>
+      </w:r>
+      <w:r>
+        <w:t>‍</w:t>
+      </w:r>
+      <w:r>
+        <w:rPr>
+          <w:rFonts w:ascii="Segoe UI Emoji" w:hAnsi="Segoe UI Emoji" w:cs="Segoe UI Emoji"/>
+        </w:rPr>
+        <w:t>🏫</w:t>
+      </w:r>
+      <w:r>
+        <w:t xml:space="preserve"> </w:t>
+      </w:r>
+      <w:r>
+        <w:rPr>
+          <w:cs/>
+        </w:rPr>
+        <w:t>របាយការណ៍វត្តមានលោកគ្រូ-អ្នកគ្រូប្រចាំថ្ងៃ (</w:t>
+      </w:r>
+      <w:r>
+        <w:t>Daily Teacher Report)</w:t>
+      </w:r>
+    </w:p>
+    <w:p>
+      <w:pPr>
+        <w:jc w:val="both"/>
+      </w:pPr>
+      <w:r>
+        <w:rPr>
+          <w:rFonts w:ascii="Segoe UI Emoji" w:hAnsi="Segoe UI Emoji" w:cs="Segoe UI Emoji"/>
+        </w:rPr>
+        <w:t>🏫</w:t>
+      </w:r>
+      <w:r>
+        <w:t xml:space="preserve"> </w:t>
+      </w:r>
+      <w:r>
+        <w:rPr>
+          <w:cs/>
+        </w:rPr>
+        <w:t>វិទ្យាល័យ ហ៊ុន សែន កំពង់កន្ទួត</w:t>
+      </w:r>
+    </w:p>
+    <w:p>
+      <w:pPr>
+        <w:jc w:val="both"/>
+      </w:pPr>
+      <w:r>
+        <w:rPr>
+          <w:rFonts w:ascii="Segoe UI Emoji" w:hAnsi="Segoe UI Emoji" w:cs="Segoe UI Emoji"/>
+        </w:rPr>
+        <w:t>📅</w:t>
+      </w:r>
+      <w:r>
+        <w:t xml:space="preserve"> </w:t>
+      </w:r>
+      <w:r>
+        <w:rPr>
+          <w:cs/>
+        </w:rPr>
+        <w:t>កាលបរិច្ឆេទ៖ ២៣/០៩/២០២៦</w:t>
+      </w:r>
+    </w:p>
+    <w:p>
+      <w:pPr>
+        <w:jc w:val="both"/>
+      </w:pPr>
+      <w:r>
+        <w:rPr>
+          <w:rFonts w:ascii="MS Mincho" w:eastAsia="MS Mincho" w:hAnsi="MS Mincho" w:cs="MS Mincho" w:hint="eastAsia"/>
+        </w:rPr>
+        <w:t>━━━━━━━━━━━━━━━━━━━━</w:t>
+      </w:r>
+    </w:p>
+    <w:p>
+      <w:pPr>
+        <w:jc w:val="both"/>
+      </w:pPr>
+      <w:r>
+        <w:rPr>
+          <w:rFonts w:ascii="Segoe UI Emoji" w:hAnsi="Segoe UI Emoji" w:cs="Segoe UI Emoji"/>
+        </w:rPr>
+        <w:t>👨</w:t>
+      </w:r>
+      <w:r>
+        <w:t>‍</w:t>
+      </w:r>
+      <w:r>
+        <w:rPr>
+          <w:rFonts w:ascii="Segoe UI Emoji" w:hAnsi="Segoe UI Emoji" w:cs="Segoe UI Emoji"/>
+        </w:rPr>
+        <w:t>🏫</w:t>
+      </w:r>
+      <w:r>
+        <w:t xml:space="preserve"> </w:t>
+      </w:r>
+      <w:r>
+        <w:rPr>
+          <w:cs/>
+        </w:rPr>
+        <w:t>អវត្តមានគ្រូបង្រៀនសរុប៖ ២ នាក់</w:t>
+      </w:r>
+    </w:p>
+    <w:p>
+      <w:pPr>
+        <w:jc w:val="both"/>
+      </w:pPr>
+      <w:r>
+        <w:t xml:space="preserve">• </w:t>
+      </w:r>
+      <w:r>
+        <w:rPr>
+          <w:rFonts w:ascii="Segoe UI Emoji" w:hAnsi="Segoe UI Emoji" w:cs="Segoe UI Emoji"/>
+        </w:rPr>
+        <w:t>❌</w:t>
+      </w:r>
+      <w:r>
+        <w:t xml:space="preserve"> </w:t>
+      </w:r>
+      <w:r>
+        <w:rPr>
+          <w:cs/>
+        </w:rPr>
+        <w:t xml:space="preserve">សុខ វិសាល (ឯកទេស គណិតវិទ្យា) - </w:t>
+      </w:r>
+      <w:r>
+        <w:t>ABSENT (</w:t>
+      </w:r>
+      <w:r>
+        <w:rPr>
+          <w:cs/>
+        </w:rPr>
+        <w:t>ឈឺ)</w:t>
+      </w:r>
+    </w:p>
+    <w:p>
+      <w:pPr>
+        <w:jc w:val="both"/>
+      </w:pPr>
+      <w:r>
+        <w:t xml:space="preserve">• </w:t>
+      </w:r>
+      <w:r>
+        <w:rPr>
+          <w:rFonts w:ascii="Segoe UI Emoji" w:hAnsi="Segoe UI Emoji" w:cs="Segoe UI Emoji"/>
+        </w:rPr>
+        <w:t>📝</w:t>
+      </w:r>
+      <w:r>
+        <w:t xml:space="preserve"> </w:t>
+      </w:r>
+      <w:r>
+        <w:rPr>
+          <w:cs/>
+        </w:rPr>
+        <w:t>ហេង វណ្ណា (ឯកទេស គីមីវិទ្យា) - សុំច្បាប់ឈប់សម្រាក (ធុរៈផ្ទាល់ខ្លួន)</w:t>
+      </w:r>
+    </w:p>
+    <w:p>
+      <w:pPr>
+        <w:jc w:val="both"/>
+      </w:pPr>
+      <w:r>
+        <w:rPr>
+          <w:rFonts w:ascii="Segoe UI Emoji" w:hAnsi="Segoe UI Emoji" w:cs="Segoe UI Emoji"/>
+        </w:rPr>
+        <w:lastRenderedPageBreak/>
+        <w:t>🕒</w:t>
+      </w:r>
+      <w:r>
+        <w:t xml:space="preserve"> </w:t>
+      </w:r>
+      <w:r>
+        <w:rPr>
+          <w:cs/>
+        </w:rPr>
+        <w:t>បញ្ជូនរបាយការណ៍នៅម៉ោង៖ ១៧:១៥</w:t>
+      </w:r>
+    </w:p>
+    <w:p>
+      <w:pPr>
+        <w:jc w:val="both"/>
+        <w:rPr>
+          <w:cs/>
+        </w:rPr>
+      </w:pPr>
+      <w:r>
+        <w:br/>
       </w:r>
     </w:p>
     <w:sectPr>
@@ -393,6 +3253,527 @@
     </w:sectPr>
   </w:body>
 </w:document>
+</file>
+
+<file path=word/numbering.xml><?xml version="1.0" encoding="utf-8"?>
+<w:numbering xmlns:wpc="http://schemas.microsoft.com/office/word/2010/wordprocessingCanvas" xmlns:cx="http://schemas.microsoft.com/office/drawing/2014/chartex" xmlns:cx1="http://schemas.microsoft.com/office/drawing/2015/9/8/chartex" xmlns:cx2="http://schemas.microsoft.com/office/drawing/2015/10/21/chartex" xmlns:cx3="http://schemas.microsoft.com/office/drawing/2016/5/9/chartex" xmlns:cx4="http://schemas.microsoft.com/office/drawing/2016/5/10/chartex" xmlns:cx5="http://schemas.microsoft.com/office/drawing/2016/5/11/chartex" xmlns:cx6="http://schemas.microsoft.com/office/drawing/2016/5/12/chartex" xmlns:cx7="http://schemas.microsoft.com/office/drawing/2016/5/13/chartex" xmlns:cx8="http://schemas.microsoft.com/office/drawing/2016/5/14/chartex" xmlns:mc="http://schemas.openxmlformats.org/markup-compatibility/2006" xmlns:aink="http://schemas.microsoft.com/office/drawing/2016/ink" xmlns:am3d="http://schemas.microsoft.com/office/drawing/2017/model3d" xmlns:o="urn:schemas-microsoft-com:office:office" xmlns:oel="http://schemas.microsoft.com/office/2019/extlst" xmlns:r="http://schemas.openxmlformats.org/officeDocument/2006/relationships" xmlns:m="http://schemas.openxmlformats.org/officeDocument/2006/math" xmlns:v="urn:schemas-microsoft-com:vml" xmlns:wp14="http://schemas.microsoft.com/office/word/2010/wordprocessingDrawing" xmlns:wp="http://schemas.openxmlformats.org/drawingml/2006/wordprocessingDrawing" xmlns:w10="urn:schemas-microsoft-com:office:word" xmlns:w="http://schemas.openxmlformats.org/wordprocessingml/2006/main" xmlns:w14="http://schemas.microsoft.com/office/word/2010/wordml" xmlns:w15="http://schemas.microsoft.com/office/word/2012/wordml" xmlns:w16cex="http://schemas.microsoft.com/office/word/2018/wordml/cex" xmlns:w16cid="http://schemas.microsoft.com/office/word/2016/wordml/cid" xmlns:w16="http://schemas.microsoft.com/office/word/2018/wordml" xmlns:w16du="http://schemas.microsoft.com/office/word/2023/wordml/word16du" xmlns:w16sdtdh="http://schemas.microsoft.com/office/word/2020/wordml/sdtdatahash" xmlns:w16sdtfl="http://schemas.microsoft.com/office/word/2024/wordml/sdtformatlock" xmlns:w16se="http://schemas.microsoft.com/office/word/2015/wordml/symex" xmlns:wpg="http://schemas.microsoft.com/office/word/2010/wordprocessingGroup" xmlns:wpi="http://schemas.microsoft.com/office/word/2010/wordprocessingInk" xmlns:wne="http://schemas.microsoft.com/office/word/2006/wordml" xmlns:wps="http://schemas.microsoft.com/office/word/2010/wordprocessingShape" mc:Ignorable="w14 w15 w16se w16cid w16 w16cex w16sdtdh w16sdtfl w16du wp14">
+  <w:abstractNum w:abstractNumId="0" w15:restartNumberingAfterBreak="0">
+    <w:nsid w:val="17E60208"/>
+    <w:multiLevelType w:val="multilevel"/>
+    <w:tmpl w:val="3FCCDF76"/>
+    <w:lvl w:ilvl="0">
+      <w:start w:val="1"/>
+      <w:numFmt w:val="decimal"/>
+      <w:lvlText w:val="%1."/>
+      <w:lvlJc w:val="left"/>
+      <w:pPr>
+        <w:tabs>
+          <w:tab w:val="num" w:pos="720"/>
+        </w:tabs>
+        <w:ind w:left="720" w:hanging="360"/>
+      </w:pPr>
+    </w:lvl>
+    <w:lvl w:ilvl="1">
+      <w:start w:val="1"/>
+      <w:numFmt w:val="bullet"/>
+      <w:lvlText w:val=""/>
+      <w:lvlJc w:val="left"/>
+      <w:pPr>
+        <w:tabs>
+          <w:tab w:val="num" w:pos="1440"/>
+        </w:tabs>
+        <w:ind w:left="1440" w:hanging="360"/>
+      </w:pPr>
+      <w:rPr>
+        <w:rFonts w:ascii="Symbol" w:hAnsi="Symbol" w:hint="default"/>
+        <w:sz w:val="20"/>
+      </w:rPr>
+    </w:lvl>
+    <w:lvl w:ilvl="2" w:tentative="1">
+      <w:start w:val="1"/>
+      <w:numFmt w:val="decimal"/>
+      <w:lvlText w:val="%3."/>
+      <w:lvlJc w:val="left"/>
+      <w:pPr>
+        <w:tabs>
+          <w:tab w:val="num" w:pos="2160"/>
+        </w:tabs>
+        <w:ind w:left="2160" w:hanging="360"/>
+      </w:pPr>
+    </w:lvl>
+    <w:lvl w:ilvl="3" w:tentative="1">
+      <w:start w:val="1"/>
+      <w:numFmt w:val="decimal"/>
+      <w:lvlText w:val="%4."/>
+      <w:lvlJc w:val="left"/>
+      <w:pPr>
+        <w:tabs>
+          <w:tab w:val="num" w:pos="2880"/>
+        </w:tabs>
+        <w:ind w:left="2880" w:hanging="360"/>
+      </w:pPr>
+    </w:lvl>
+    <w:lvl w:ilvl="4" w:tentative="1">
+      <w:start w:val="1"/>
+      <w:numFmt w:val="decimal"/>
+      <w:lvlText w:val="%5."/>
+      <w:lvlJc w:val="left"/>
+      <w:pPr>
+        <w:tabs>
+          <w:tab w:val="num" w:pos="3600"/>
+        </w:tabs>
+        <w:ind w:left="3600" w:hanging="360"/>
+      </w:pPr>
+    </w:lvl>
+    <w:lvl w:ilvl="5" w:tentative="1">
+      <w:start w:val="1"/>
+      <w:numFmt w:val="decimal"/>
+      <w:lvlText w:val="%6."/>
+      <w:lvlJc w:val="left"/>
+      <w:pPr>
+        <w:tabs>
+          <w:tab w:val="num" w:pos="4320"/>
+        </w:tabs>
+        <w:ind w:left="4320" w:hanging="360"/>
+      </w:pPr>
+    </w:lvl>
+    <w:lvl w:ilvl="6" w:tentative="1">
+      <w:start w:val="1"/>
+      <w:numFmt w:val="decimal"/>
+      <w:lvlText w:val="%7."/>
+      <w:lvlJc w:val="left"/>
+      <w:pPr>
+        <w:tabs>
+          <w:tab w:val="num" w:pos="5040"/>
+        </w:tabs>
+        <w:ind w:left="5040" w:hanging="360"/>
+      </w:pPr>
+    </w:lvl>
+    <w:lvl w:ilvl="7" w:tentative="1">
+      <w:start w:val="1"/>
+      <w:numFmt w:val="decimal"/>
+      <w:lvlText w:val="%8."/>
+      <w:lvlJc w:val="left"/>
+      <w:pPr>
+        <w:tabs>
+          <w:tab w:val="num" w:pos="5760"/>
+        </w:tabs>
+        <w:ind w:left="5760" w:hanging="360"/>
+      </w:pPr>
+    </w:lvl>
+    <w:lvl w:ilvl="8" w:tentative="1">
+      <w:start w:val="1"/>
+      <w:numFmt w:val="decimal"/>
+      <w:lvlText w:val="%9."/>
+      <w:lvlJc w:val="left"/>
+      <w:pPr>
+        <w:tabs>
+          <w:tab w:val="num" w:pos="6480"/>
+        </w:tabs>
+        <w:ind w:left="6480" w:hanging="360"/>
+      </w:pPr>
+    </w:lvl>
+  </w:abstractNum>
+  <w:abstractNum w:abstractNumId="1" w15:restartNumberingAfterBreak="0">
+    <w:nsid w:val="312F06EA"/>
+    <w:multiLevelType w:val="multilevel"/>
+    <w:tmpl w:val="CF78AFE4"/>
+    <w:lvl w:ilvl="0">
+      <w:start w:val="1"/>
+      <w:numFmt w:val="bullet"/>
+      <w:lvlText w:val=""/>
+      <w:lvlJc w:val="left"/>
+      <w:pPr>
+        <w:tabs>
+          <w:tab w:val="num" w:pos="720"/>
+        </w:tabs>
+        <w:ind w:left="720" w:hanging="360"/>
+      </w:pPr>
+      <w:rPr>
+        <w:rFonts w:ascii="Symbol" w:hAnsi="Symbol" w:hint="default"/>
+        <w:sz w:val="20"/>
+      </w:rPr>
+    </w:lvl>
+    <w:lvl w:ilvl="1" w:tentative="1">
+      <w:start w:val="1"/>
+      <w:numFmt w:val="bullet"/>
+      <w:lvlText w:val=""/>
+      <w:lvlJc w:val="left"/>
+      <w:pPr>
+        <w:tabs>
+          <w:tab w:val="num" w:pos="1440"/>
+        </w:tabs>
+        <w:ind w:left="1440" w:hanging="360"/>
+      </w:pPr>
+      <w:rPr>
+        <w:rFonts w:ascii="Symbol" w:hAnsi="Symbol" w:hint="default"/>
+        <w:sz w:val="20"/>
+      </w:rPr>
+    </w:lvl>
+    <w:lvl w:ilvl="2" w:tentative="1">
+      <w:start w:val="1"/>
+      <w:numFmt w:val="bullet"/>
+      <w:lvlText w:val=""/>
+      <w:lvlJc w:val="left"/>
+      <w:pPr>
+        <w:tabs>
+          <w:tab w:val="num" w:pos="2160"/>
+        </w:tabs>
+        <w:ind w:left="2160" w:hanging="360"/>
+      </w:pPr>
+      <w:rPr>
+        <w:rFonts w:ascii="Symbol" w:hAnsi="Symbol" w:hint="default"/>
+        <w:sz w:val="20"/>
+      </w:rPr>
+    </w:lvl>
+    <w:lvl w:ilvl="3" w:tentative="1">
+      <w:start w:val="1"/>
+      <w:numFmt w:val="bullet"/>
+      <w:lvlText w:val=""/>
+      <w:lvlJc w:val="left"/>
+      <w:pPr>
+        <w:tabs>
+          <w:tab w:val="num" w:pos="2880"/>
+        </w:tabs>
+        <w:ind w:left="2880" w:hanging="360"/>
+      </w:pPr>
+      <w:rPr>
+        <w:rFonts w:ascii="Symbol" w:hAnsi="Symbol" w:hint="default"/>
+        <w:sz w:val="20"/>
+      </w:rPr>
+    </w:lvl>
+    <w:lvl w:ilvl="4" w:tentative="1">
+      <w:start w:val="1"/>
+      <w:numFmt w:val="bullet"/>
+      <w:lvlText w:val=""/>
+      <w:lvlJc w:val="left"/>
+      <w:pPr>
+        <w:tabs>
+          <w:tab w:val="num" w:pos="3600"/>
+        </w:tabs>
+        <w:ind w:left="3600" w:hanging="360"/>
+      </w:pPr>
+      <w:rPr>
+        <w:rFonts w:ascii="Symbol" w:hAnsi="Symbol" w:hint="default"/>
+        <w:sz w:val="20"/>
+      </w:rPr>
+    </w:lvl>
+    <w:lvl w:ilvl="5" w:tentative="1">
+      <w:start w:val="1"/>
+      <w:numFmt w:val="bullet"/>
+      <w:lvlText w:val=""/>
+      <w:lvlJc w:val="left"/>
+      <w:pPr>
+        <w:tabs>
+          <w:tab w:val="num" w:pos="4320"/>
+        </w:tabs>
+        <w:ind w:left="4320" w:hanging="360"/>
+      </w:pPr>
+      <w:rPr>
+        <w:rFonts w:ascii="Symbol" w:hAnsi="Symbol" w:hint="default"/>
+        <w:sz w:val="20"/>
+      </w:rPr>
+    </w:lvl>
+    <w:lvl w:ilvl="6" w:tentative="1">
+      <w:start w:val="1"/>
+      <w:numFmt w:val="bullet"/>
+      <w:lvlText w:val=""/>
+      <w:lvlJc w:val="left"/>
+      <w:pPr>
+        <w:tabs>
+          <w:tab w:val="num" w:pos="5040"/>
+        </w:tabs>
+        <w:ind w:left="5040" w:hanging="360"/>
+      </w:pPr>
+      <w:rPr>
+        <w:rFonts w:ascii="Symbol" w:hAnsi="Symbol" w:hint="default"/>
+        <w:sz w:val="20"/>
+      </w:rPr>
+    </w:lvl>
+    <w:lvl w:ilvl="7" w:tentative="1">
+      <w:start w:val="1"/>
+      <w:numFmt w:val="bullet"/>
+      <w:lvlText w:val=""/>
+      <w:lvlJc w:val="left"/>
+      <w:pPr>
+        <w:tabs>
+          <w:tab w:val="num" w:pos="5760"/>
+        </w:tabs>
+        <w:ind w:left="5760" w:hanging="360"/>
+      </w:pPr>
+      <w:rPr>
+        <w:rFonts w:ascii="Symbol" w:hAnsi="Symbol" w:hint="default"/>
+        <w:sz w:val="20"/>
+      </w:rPr>
+    </w:lvl>
+    <w:lvl w:ilvl="8" w:tentative="1">
+      <w:start w:val="1"/>
+      <w:numFmt w:val="bullet"/>
+      <w:lvlText w:val=""/>
+      <w:lvlJc w:val="left"/>
+      <w:pPr>
+        <w:tabs>
+          <w:tab w:val="num" w:pos="6480"/>
+        </w:tabs>
+        <w:ind w:left="6480" w:hanging="360"/>
+      </w:pPr>
+      <w:rPr>
+        <w:rFonts w:ascii="Symbol" w:hAnsi="Symbol" w:hint="default"/>
+        <w:sz w:val="20"/>
+      </w:rPr>
+    </w:lvl>
+  </w:abstractNum>
+  <w:abstractNum w:abstractNumId="2" w15:restartNumberingAfterBreak="0">
+    <w:nsid w:val="5FED624D"/>
+    <w:multiLevelType w:val="multilevel"/>
+    <w:tmpl w:val="BDF4D1DE"/>
+    <w:lvl w:ilvl="0">
+      <w:start w:val="1"/>
+      <w:numFmt w:val="decimal"/>
+      <w:lvlText w:val="%1."/>
+      <w:lvlJc w:val="left"/>
+      <w:pPr>
+        <w:tabs>
+          <w:tab w:val="num" w:pos="720"/>
+        </w:tabs>
+        <w:ind w:left="720" w:hanging="360"/>
+      </w:pPr>
+    </w:lvl>
+    <w:lvl w:ilvl="1">
+      <w:start w:val="1"/>
+      <w:numFmt w:val="bullet"/>
+      <w:lvlText w:val=""/>
+      <w:lvlJc w:val="left"/>
+      <w:pPr>
+        <w:tabs>
+          <w:tab w:val="num" w:pos="1440"/>
+        </w:tabs>
+        <w:ind w:left="1440" w:hanging="360"/>
+      </w:pPr>
+      <w:rPr>
+        <w:rFonts w:ascii="Symbol" w:hAnsi="Symbol" w:hint="default"/>
+        <w:sz w:val="20"/>
+      </w:rPr>
+    </w:lvl>
+    <w:lvl w:ilvl="2">
+      <w:start w:val="1"/>
+      <w:numFmt w:val="bullet"/>
+      <w:lvlText w:val=""/>
+      <w:lvlJc w:val="left"/>
+      <w:pPr>
+        <w:tabs>
+          <w:tab w:val="num" w:pos="2160"/>
+        </w:tabs>
+        <w:ind w:left="2160" w:hanging="360"/>
+      </w:pPr>
+      <w:rPr>
+        <w:rFonts w:ascii="Symbol" w:hAnsi="Symbol" w:hint="default"/>
+        <w:sz w:val="20"/>
+      </w:rPr>
+    </w:lvl>
+    <w:lvl w:ilvl="3" w:tentative="1">
+      <w:start w:val="1"/>
+      <w:numFmt w:val="decimal"/>
+      <w:lvlText w:val="%4."/>
+      <w:lvlJc w:val="left"/>
+      <w:pPr>
+        <w:tabs>
+          <w:tab w:val="num" w:pos="2880"/>
+        </w:tabs>
+        <w:ind w:left="2880" w:hanging="360"/>
+      </w:pPr>
+    </w:lvl>
+    <w:lvl w:ilvl="4" w:tentative="1">
+      <w:start w:val="1"/>
+      <w:numFmt w:val="decimal"/>
+      <w:lvlText w:val="%5."/>
+      <w:lvlJc w:val="left"/>
+      <w:pPr>
+        <w:tabs>
+          <w:tab w:val="num" w:pos="3600"/>
+        </w:tabs>
+        <w:ind w:left="3600" w:hanging="360"/>
+      </w:pPr>
+    </w:lvl>
+    <w:lvl w:ilvl="5" w:tentative="1">
+      <w:start w:val="1"/>
+      <w:numFmt w:val="decimal"/>
+      <w:lvlText w:val="%6."/>
+      <w:lvlJc w:val="left"/>
+      <w:pPr>
+        <w:tabs>
+          <w:tab w:val="num" w:pos="4320"/>
+        </w:tabs>
+        <w:ind w:left="4320" w:hanging="360"/>
+      </w:pPr>
+    </w:lvl>
+    <w:lvl w:ilvl="6" w:tentative="1">
+      <w:start w:val="1"/>
+      <w:numFmt w:val="decimal"/>
+      <w:lvlText w:val="%7."/>
+      <w:lvlJc w:val="left"/>
+      <w:pPr>
+        <w:tabs>
+          <w:tab w:val="num" w:pos="5040"/>
+        </w:tabs>
+        <w:ind w:left="5040" w:hanging="360"/>
+      </w:pPr>
+    </w:lvl>
+    <w:lvl w:ilvl="7" w:tentative="1">
+      <w:start w:val="1"/>
+      <w:numFmt w:val="decimal"/>
+      <w:lvlText w:val="%8."/>
+      <w:lvlJc w:val="left"/>
+      <w:pPr>
+        <w:tabs>
+          <w:tab w:val="num" w:pos="5760"/>
+        </w:tabs>
+        <w:ind w:left="5760" w:hanging="360"/>
+      </w:pPr>
+    </w:lvl>
+    <w:lvl w:ilvl="8" w:tentative="1">
+      <w:start w:val="1"/>
+      <w:numFmt w:val="decimal"/>
+      <w:lvlText w:val="%9."/>
+      <w:lvlJc w:val="left"/>
+      <w:pPr>
+        <w:tabs>
+          <w:tab w:val="num" w:pos="6480"/>
+        </w:tabs>
+        <w:ind w:left="6480" w:hanging="360"/>
+      </w:pPr>
+    </w:lvl>
+  </w:abstractNum>
+  <w:abstractNum w:abstractNumId="3" w15:restartNumberingAfterBreak="0">
+    <w:nsid w:val="65F35AFF"/>
+    <w:multiLevelType w:val="multilevel"/>
+    <w:tmpl w:val="62AE446C"/>
+    <w:lvl w:ilvl="0">
+      <w:start w:val="1"/>
+      <w:numFmt w:val="decimal"/>
+      <w:lvlText w:val="%1."/>
+      <w:lvlJc w:val="left"/>
+      <w:pPr>
+        <w:tabs>
+          <w:tab w:val="num" w:pos="720"/>
+        </w:tabs>
+        <w:ind w:left="720" w:hanging="360"/>
+      </w:pPr>
+    </w:lvl>
+    <w:lvl w:ilvl="1">
+      <w:start w:val="1"/>
+      <w:numFmt w:val="bullet"/>
+      <w:lvlText w:val=""/>
+      <w:lvlJc w:val="left"/>
+      <w:pPr>
+        <w:tabs>
+          <w:tab w:val="num" w:pos="1440"/>
+        </w:tabs>
+        <w:ind w:left="1440" w:hanging="360"/>
+      </w:pPr>
+      <w:rPr>
+        <w:rFonts w:ascii="Symbol" w:hAnsi="Symbol" w:hint="default"/>
+        <w:sz w:val="20"/>
+      </w:rPr>
+    </w:lvl>
+    <w:lvl w:ilvl="2" w:tentative="1">
+      <w:start w:val="1"/>
+      <w:numFmt w:val="decimal"/>
+      <w:lvlText w:val="%3."/>
+      <w:lvlJc w:val="left"/>
+      <w:pPr>
+        <w:tabs>
+          <w:tab w:val="num" w:pos="2160"/>
+        </w:tabs>
+        <w:ind w:left="2160" w:hanging="360"/>
+      </w:pPr>
+    </w:lvl>
+    <w:lvl w:ilvl="3" w:tentative="1">
+      <w:start w:val="1"/>
+      <w:numFmt w:val="decimal"/>
+      <w:lvlText w:val="%4."/>
+      <w:lvlJc w:val="left"/>
+      <w:pPr>
+        <w:tabs>
+          <w:tab w:val="num" w:pos="2880"/>
+        </w:tabs>
+        <w:ind w:left="2880" w:hanging="360"/>
+      </w:pPr>
+    </w:lvl>
+    <w:lvl w:ilvl="4" w:tentative="1">
+      <w:start w:val="1"/>
+      <w:numFmt w:val="decimal"/>
+      <w:lvlText w:val="%5."/>
+      <w:lvlJc w:val="left"/>
+      <w:pPr>
+        <w:tabs>
+          <w:tab w:val="num" w:pos="3600"/>
+        </w:tabs>
+        <w:ind w:left="3600" w:hanging="360"/>
+      </w:pPr>
+    </w:lvl>
+    <w:lvl w:ilvl="5" w:tentative="1">
+      <w:start w:val="1"/>
+      <w:numFmt w:val="decimal"/>
+      <w:lvlText w:val="%6."/>
+      <w:lvlJc w:val="left"/>
+      <w:pPr>
+        <w:tabs>
+          <w:tab w:val="num" w:pos="4320"/>
+        </w:tabs>
+        <w:ind w:left="4320" w:hanging="360"/>
+      </w:pPr>
+    </w:lvl>
+    <w:lvl w:ilvl="6" w:tentative="1">
+      <w:start w:val="1"/>
+      <w:numFmt w:val="decimal"/>
+      <w:lvlText w:val="%7."/>
+      <w:lvlJc w:val="left"/>
+      <w:pPr>
+        <w:tabs>
+          <w:tab w:val="num" w:pos="5040"/>
+        </w:tabs>
+        <w:ind w:left="5040" w:hanging="360"/>
+      </w:pPr>
+    </w:lvl>
+    <w:lvl w:ilvl="7" w:tentative="1">
+      <w:start w:val="1"/>
+      <w:numFmt w:val="decimal"/>
+      <w:lvlText w:val="%8."/>
+      <w:lvlJc w:val="left"/>
+      <w:pPr>
+        <w:tabs>
+          <w:tab w:val="num" w:pos="5760"/>
+        </w:tabs>
+        <w:ind w:left="5760" w:hanging="360"/>
+      </w:pPr>
+    </w:lvl>
+    <w:lvl w:ilvl="8" w:tentative="1">
+      <w:start w:val="1"/>
+      <w:numFmt w:val="decimal"/>
+      <w:lvlText w:val="%9."/>
+      <w:lvlJc w:val="left"/>
+      <w:pPr>
+        <w:tabs>
+          <w:tab w:val="num" w:pos="6480"/>
+        </w:tabs>
+        <w:ind w:left="6480" w:hanging="360"/>
+      </w:pPr>
+    </w:lvl>
+  </w:abstractNum>
+  <w:num w:numId="1" w16cid:durableId="515659198">
+    <w:abstractNumId w:val="3"/>
+  </w:num>
+  <w:num w:numId="2" w16cid:durableId="678503181">
+    <w:abstractNumId w:val="1"/>
+  </w:num>
+  <w:num w:numId="3" w16cid:durableId="1522667260">
+    <w:abstractNumId w:val="2"/>
+  </w:num>
+  <w:num w:numId="4" w16cid:durableId="642781328">
+    <w:abstractNumId w:val="0"/>
+  </w:num>
+</w:numbering>
 </file>
 
 <file path=word/styles.xml><?xml version="1.0" encoding="utf-8"?>
@@ -1002,7 +4383,6 @@
   <w:style w:type="character" w:default="1" w:styleId="DefaultParagraphFont">
     <w:name w:val="Default Paragraph Font"/>
     <w:uiPriority w:val="1"/>
-    <w:semiHidden/>
     <w:unhideWhenUsed/>
   </w:style>
   <w:style w:type="table" w:default="1" w:styleId="TableNormal">

</xml_diff>